<commit_message>
dec 2025 finished hours, liturgy
</commit_message>
<xml_diff>
--- a/flow/20230927_hours/тропарі-святкові/тропарі-святкові-12.docx
+++ b/flow/20230927_hours/тропарі-святкові/тропарі-святкові-12.docx
@@ -4,7 +4,7 @@
   <w:body>
     <w:p>
       <w:pPr>
-        <w:pStyle w:val="1"/>
+        <w:pStyle w:val="Heading1"/>
         <w:ind w:left="0" w:hanging="2"/>
         <w:rPr>
           <w:rFonts w:ascii="Times New Roman" w:hAnsi="Times New Roman" w:cs="Times New Roman"/>
@@ -72,9 +72,8 @@
           <w:sz w:val="24"/>
           <w:szCs w:val="24"/>
         </w:rPr>
-        <w:t xml:space="preserve"> Готуйся, </w:t>
-      </w:r>
-      <w:proofErr w:type="spellStart"/>
+        <w:t xml:space="preserve"> </w:t>
+      </w:r>
       <w:r>
         <w:rPr>
           <w:rFonts w:ascii="Times New Roman" w:eastAsia="Times New Roman" w:hAnsi="Times New Roman" w:cs="Times New Roman"/>
@@ -83,89 +82,12 @@
           <w:sz w:val="24"/>
           <w:szCs w:val="24"/>
         </w:rPr>
-        <w:t>Вифлеєме</w:t>
-      </w:r>
-      <w:proofErr w:type="spellEnd"/>
-      <w:r>
-        <w:rPr>
-          <w:rFonts w:ascii="Times New Roman" w:eastAsia="Times New Roman" w:hAnsi="Times New Roman" w:cs="Times New Roman"/>
-          <w:color w:val="333333"/>
-          <w:position w:val="0"/>
-          <w:sz w:val="24"/>
-          <w:szCs w:val="24"/>
-        </w:rPr>
-        <w:t xml:space="preserve">, розкрийся всім, </w:t>
-      </w:r>
-      <w:proofErr w:type="spellStart"/>
-      <w:r>
-        <w:rPr>
-          <w:rFonts w:ascii="Times New Roman" w:eastAsia="Times New Roman" w:hAnsi="Times New Roman" w:cs="Times New Roman"/>
-          <w:color w:val="333333"/>
-          <w:position w:val="0"/>
-          <w:sz w:val="24"/>
-          <w:szCs w:val="24"/>
-        </w:rPr>
-        <w:t>Єдеме</w:t>
-      </w:r>
-      <w:proofErr w:type="spellEnd"/>
-      <w:r>
-        <w:rPr>
-          <w:rFonts w:ascii="Times New Roman" w:eastAsia="Times New Roman" w:hAnsi="Times New Roman" w:cs="Times New Roman"/>
-          <w:color w:val="333333"/>
-          <w:position w:val="0"/>
-          <w:sz w:val="24"/>
-          <w:szCs w:val="24"/>
-        </w:rPr>
-        <w:t xml:space="preserve">,* красуйся, Євфрате,* бо дерево життя в вертепі розквітнуло від Діви.* Її лоно раєм </w:t>
-      </w:r>
-      <w:proofErr w:type="spellStart"/>
-      <w:r>
-        <w:rPr>
-          <w:rFonts w:ascii="Times New Roman" w:eastAsia="Times New Roman" w:hAnsi="Times New Roman" w:cs="Times New Roman"/>
-          <w:color w:val="333333"/>
-          <w:position w:val="0"/>
-          <w:sz w:val="24"/>
-          <w:szCs w:val="24"/>
-        </w:rPr>
-        <w:t>мисленним</w:t>
-      </w:r>
-      <w:proofErr w:type="spellEnd"/>
-      <w:r>
-        <w:rPr>
-          <w:rFonts w:ascii="Times New Roman" w:eastAsia="Times New Roman" w:hAnsi="Times New Roman" w:cs="Times New Roman"/>
-          <w:color w:val="333333"/>
-          <w:position w:val="0"/>
-          <w:sz w:val="24"/>
-          <w:szCs w:val="24"/>
-        </w:rPr>
-        <w:t xml:space="preserve"> явилось, в якому – божественний сад.* 3 нього ївши будемо жити – і не як Адам помремо.* Христос </w:t>
-      </w:r>
-      <w:proofErr w:type="spellStart"/>
-      <w:r>
-        <w:rPr>
-          <w:rFonts w:ascii="Times New Roman" w:eastAsia="Times New Roman" w:hAnsi="Times New Roman" w:cs="Times New Roman"/>
-          <w:color w:val="333333"/>
-          <w:position w:val="0"/>
-          <w:sz w:val="24"/>
-          <w:szCs w:val="24"/>
-        </w:rPr>
-        <w:t>раждається</w:t>
-      </w:r>
-      <w:proofErr w:type="spellEnd"/>
-      <w:r>
-        <w:rPr>
-          <w:rFonts w:ascii="Times New Roman" w:eastAsia="Times New Roman" w:hAnsi="Times New Roman" w:cs="Times New Roman"/>
-          <w:color w:val="333333"/>
-          <w:position w:val="0"/>
-          <w:sz w:val="24"/>
-          <w:szCs w:val="24"/>
-        </w:rPr>
-        <w:t>, щоб оновити упалий колись образ.</w:t>
-      </w:r>
-    </w:p>
-    <w:p>
-      <w:pPr>
-        <w:pStyle w:val="a5"/>
+        <w:t>Готу́йся, Вифлеє́ме, розкри́йся всім, Єде́ме,* красу́йся, Євфра́те,* бо де́рево життя́ в верте́пі розкві́тнуло від Ді́ви.* Її́ ло́но ра́єм ми́сленним яви́лось, в яко́му – боже́ственний сад.* 3 ньо́го ї́вши, бу́демо жи́ти – і не, як Ада́м, помре́мо.* Христо́с ражда́ється, щоб онови́ти упа́лий коли́сь о́браз.</w:t>
+      </w:r>
+    </w:p>
+    <w:p>
+      <w:pPr>
+        <w:pStyle w:val="NormalWeb"/>
         <w:ind w:left="0" w:hanging="2"/>
         <w:rPr>
           <w:rFonts w:cs="Times New Roman"/>
@@ -188,48 +110,20 @@
           <w:color w:val="333333"/>
           <w:position w:val="0"/>
         </w:rPr>
-        <w:t xml:space="preserve"> Діва днесь гряде, щоб невимовно родити у вертепі </w:t>
-      </w:r>
-      <w:proofErr w:type="spellStart"/>
+        <w:t xml:space="preserve"> </w:t>
+      </w:r>
       <w:r>
         <w:rPr>
           <w:rFonts w:cs="Times New Roman"/>
           <w:color w:val="333333"/>
           <w:position w:val="0"/>
         </w:rPr>
-        <w:t>превічне</w:t>
-      </w:r>
-      <w:proofErr w:type="spellEnd"/>
-      <w:r>
-        <w:rPr>
-          <w:rFonts w:cs="Times New Roman"/>
-          <w:color w:val="333333"/>
-          <w:position w:val="0"/>
-        </w:rPr>
-        <w:t xml:space="preserve"> Слово.* Радій, </w:t>
-      </w:r>
-      <w:proofErr w:type="spellStart"/>
-      <w:r>
-        <w:rPr>
-          <w:rFonts w:cs="Times New Roman"/>
-          <w:color w:val="333333"/>
-          <w:position w:val="0"/>
-        </w:rPr>
-        <w:t>вселенно</w:t>
-      </w:r>
-      <w:proofErr w:type="spellEnd"/>
-      <w:r>
-        <w:rPr>
-          <w:rFonts w:cs="Times New Roman"/>
-          <w:color w:val="333333"/>
-          <w:position w:val="0"/>
-        </w:rPr>
-        <w:t>, почувши це,* прослав з ангелами й пастирями* того, що хоче явитися дитям малим – превічного Бога. </w:t>
-      </w:r>
-    </w:p>
-    <w:p>
-      <w:pPr>
-        <w:pStyle w:val="1"/>
+        <w:t>Ді́ва днесь гряде́, щоб невимо́вно роди́ти у верте́пі предві́чне Сло́во.* Раді́й, вселе́нно, почу́вши це,* просла́в з а́нгелами й па́стирями* Того́, що хо́че яви́тися дитя́м мали́м – предві́чного Бо́га.</w:t>
+      </w:r>
+    </w:p>
+    <w:p>
+      <w:pPr>
+        <w:pStyle w:val="Heading1"/>
         <w:ind w:left="0" w:hanging="2"/>
         <w:rPr>
           <w:rFonts w:ascii="Times New Roman" w:hAnsi="Times New Roman" w:cs="Times New Roman"/>
@@ -253,23 +147,13 @@
         </w:rPr>
         <w:t xml:space="preserve"> </w:t>
       </w:r>
-      <w:proofErr w:type="spellStart"/>
-      <w:r>
-        <w:rPr>
-          <w:rFonts w:ascii="Times New Roman" w:hAnsi="Times New Roman" w:cs="Times New Roman"/>
-          <w:sz w:val="24"/>
-          <w:szCs w:val="24"/>
-        </w:rPr>
-        <w:t>сщмч.Ігнатія</w:t>
-      </w:r>
-      <w:proofErr w:type="spellEnd"/>
-      <w:r>
-        <w:rPr>
-          <w:rFonts w:ascii="Times New Roman" w:hAnsi="Times New Roman" w:cs="Times New Roman"/>
-          <w:sz w:val="24"/>
-          <w:szCs w:val="24"/>
-        </w:rPr>
-        <w:t xml:space="preserve"> Богоносця</w:t>
+      <w:r>
+        <w:rPr>
+          <w:rFonts w:ascii="Times New Roman" w:hAnsi="Times New Roman" w:cs="Times New Roman"/>
+          <w:sz w:val="24"/>
+          <w:szCs w:val="24"/>
+        </w:rPr>
+        <w:t>сщмч.Ігнатія Богоносця</w:t>
       </w:r>
     </w:p>
     <w:p>
@@ -307,9 +191,8 @@
           <w:sz w:val="24"/>
           <w:szCs w:val="24"/>
         </w:rPr>
-        <w:t xml:space="preserve"> Готуйся, </w:t>
-      </w:r>
-      <w:proofErr w:type="spellStart"/>
+        <w:t xml:space="preserve"> </w:t>
+      </w:r>
       <w:r>
         <w:rPr>
           <w:rFonts w:ascii="Times New Roman" w:eastAsia="Times New Roman" w:hAnsi="Times New Roman" w:cs="Times New Roman"/>
@@ -318,89 +201,12 @@
           <w:sz w:val="24"/>
           <w:szCs w:val="24"/>
         </w:rPr>
-        <w:t>Вифлеєме</w:t>
-      </w:r>
-      <w:proofErr w:type="spellEnd"/>
-      <w:r>
-        <w:rPr>
-          <w:rFonts w:ascii="Times New Roman" w:eastAsia="Times New Roman" w:hAnsi="Times New Roman" w:cs="Times New Roman"/>
-          <w:color w:val="333333"/>
-          <w:position w:val="0"/>
-          <w:sz w:val="24"/>
-          <w:szCs w:val="24"/>
-        </w:rPr>
-        <w:t xml:space="preserve">, розкрийся всім, </w:t>
-      </w:r>
-      <w:proofErr w:type="spellStart"/>
-      <w:r>
-        <w:rPr>
-          <w:rFonts w:ascii="Times New Roman" w:eastAsia="Times New Roman" w:hAnsi="Times New Roman" w:cs="Times New Roman"/>
-          <w:color w:val="333333"/>
-          <w:position w:val="0"/>
-          <w:sz w:val="24"/>
-          <w:szCs w:val="24"/>
-        </w:rPr>
-        <w:t>Єдеме</w:t>
-      </w:r>
-      <w:proofErr w:type="spellEnd"/>
-      <w:r>
-        <w:rPr>
-          <w:rFonts w:ascii="Times New Roman" w:eastAsia="Times New Roman" w:hAnsi="Times New Roman" w:cs="Times New Roman"/>
-          <w:color w:val="333333"/>
-          <w:position w:val="0"/>
-          <w:sz w:val="24"/>
-          <w:szCs w:val="24"/>
-        </w:rPr>
-        <w:t xml:space="preserve">,* красуйся, Євфрате,* бо дерево життя в вертепі розквітнуло від Діви.* Її лоно раєм </w:t>
-      </w:r>
-      <w:proofErr w:type="spellStart"/>
-      <w:r>
-        <w:rPr>
-          <w:rFonts w:ascii="Times New Roman" w:eastAsia="Times New Roman" w:hAnsi="Times New Roman" w:cs="Times New Roman"/>
-          <w:color w:val="333333"/>
-          <w:position w:val="0"/>
-          <w:sz w:val="24"/>
-          <w:szCs w:val="24"/>
-        </w:rPr>
-        <w:t>мисленним</w:t>
-      </w:r>
-      <w:proofErr w:type="spellEnd"/>
-      <w:r>
-        <w:rPr>
-          <w:rFonts w:ascii="Times New Roman" w:eastAsia="Times New Roman" w:hAnsi="Times New Roman" w:cs="Times New Roman"/>
-          <w:color w:val="333333"/>
-          <w:position w:val="0"/>
-          <w:sz w:val="24"/>
-          <w:szCs w:val="24"/>
-        </w:rPr>
-        <w:t xml:space="preserve"> явилось, в якому – божественний сад.* 3 нього ївши будемо жити – і не як Адам помремо.* Христос </w:t>
-      </w:r>
-      <w:proofErr w:type="spellStart"/>
-      <w:r>
-        <w:rPr>
-          <w:rFonts w:ascii="Times New Roman" w:eastAsia="Times New Roman" w:hAnsi="Times New Roman" w:cs="Times New Roman"/>
-          <w:color w:val="333333"/>
-          <w:position w:val="0"/>
-          <w:sz w:val="24"/>
-          <w:szCs w:val="24"/>
-        </w:rPr>
-        <w:t>раждається</w:t>
-      </w:r>
-      <w:proofErr w:type="spellEnd"/>
-      <w:r>
-        <w:rPr>
-          <w:rFonts w:ascii="Times New Roman" w:eastAsia="Times New Roman" w:hAnsi="Times New Roman" w:cs="Times New Roman"/>
-          <w:color w:val="333333"/>
-          <w:position w:val="0"/>
-          <w:sz w:val="24"/>
-          <w:szCs w:val="24"/>
-        </w:rPr>
-        <w:t>, щоб оновити упалий колись образ.</w:t>
-      </w:r>
-    </w:p>
-    <w:p>
-      <w:pPr>
-        <w:pStyle w:val="a5"/>
+        <w:t>Готу́йся, Вифлеє́ме, розкри́йся всім, Єде́ме,* красу́йся, Євфра́те,* бо де́рево життя́ в верте́пі розкві́тнуло від Ді́ви.* Її́ ло́но ра́єм ми́сленним яви́лось, в яко́му – боже́ственний сад.* 3 ньо́го ї́вши, бу́демо жи́ти – і не, як Ада́м, помре́мо.* Христо́с ражда́ється, щоб онови́ти упа́лий коли́сь о́браз.</w:t>
+      </w:r>
+    </w:p>
+    <w:p>
+      <w:pPr>
+        <w:pStyle w:val="NormalWeb"/>
         <w:ind w:left="0" w:hanging="2"/>
         <w:rPr>
           <w:rFonts w:cs="Times New Roman"/>
@@ -423,48 +229,20 @@
           <w:color w:val="333333"/>
           <w:position w:val="0"/>
         </w:rPr>
-        <w:t xml:space="preserve"> Діва днесь гряде, щоб невимовно родити у вертепі </w:t>
-      </w:r>
-      <w:proofErr w:type="spellStart"/>
+        <w:t xml:space="preserve"> </w:t>
+      </w:r>
       <w:r>
         <w:rPr>
           <w:rFonts w:cs="Times New Roman"/>
           <w:color w:val="333333"/>
           <w:position w:val="0"/>
         </w:rPr>
-        <w:t>превічне</w:t>
-      </w:r>
-      <w:proofErr w:type="spellEnd"/>
-      <w:r>
-        <w:rPr>
-          <w:rFonts w:cs="Times New Roman"/>
-          <w:color w:val="333333"/>
-          <w:position w:val="0"/>
-        </w:rPr>
-        <w:t xml:space="preserve"> Слово.* Радій, </w:t>
-      </w:r>
-      <w:proofErr w:type="spellStart"/>
-      <w:r>
-        <w:rPr>
-          <w:rFonts w:cs="Times New Roman"/>
-          <w:color w:val="333333"/>
-          <w:position w:val="0"/>
-        </w:rPr>
-        <w:t>вселенно</w:t>
-      </w:r>
-      <w:proofErr w:type="spellEnd"/>
-      <w:r>
-        <w:rPr>
-          <w:rFonts w:cs="Times New Roman"/>
-          <w:color w:val="333333"/>
-          <w:position w:val="0"/>
-        </w:rPr>
-        <w:t>, почувши це,* прослав з ангелами й пастирями* того, що хоче явитися дитям малим – превічного Бога. </w:t>
-      </w:r>
-    </w:p>
-    <w:p>
-      <w:pPr>
-        <w:pStyle w:val="1"/>
+        <w:t>Ді́ва днесь гряде́, щоб невимо́вно роди́ти у верте́пі предві́чне Сло́во.* Раді́й, вселе́нно, почу́вши це,* просла́в з а́нгелами й па́стирями* Того́, що хо́че яви́тися дитя́м мали́м – предві́чного Бо́га.</w:t>
+      </w:r>
+    </w:p>
+    <w:p>
+      <w:pPr>
+        <w:pStyle w:val="Heading1"/>
         <w:ind w:left="0" w:hanging="2"/>
         <w:rPr>
           <w:rFonts w:ascii="Times New Roman" w:hAnsi="Times New Roman" w:cs="Times New Roman"/>
@@ -488,34 +266,46 @@
         </w:rPr>
         <w:t xml:space="preserve"> </w:t>
       </w:r>
-      <w:proofErr w:type="spellStart"/>
-      <w:r>
-        <w:rPr>
-          <w:rFonts w:ascii="Times New Roman" w:hAnsi="Times New Roman" w:cs="Times New Roman"/>
-          <w:sz w:val="24"/>
-          <w:szCs w:val="24"/>
-        </w:rPr>
-        <w:t>муч.Юліанії</w:t>
-      </w:r>
-      <w:proofErr w:type="spellEnd"/>
-      <w:r>
-        <w:rPr>
-          <w:rFonts w:ascii="Times New Roman" w:hAnsi="Times New Roman" w:cs="Times New Roman"/>
-          <w:sz w:val="24"/>
-          <w:szCs w:val="24"/>
-        </w:rPr>
-        <w:t xml:space="preserve"> </w:t>
-      </w:r>
-      <w:proofErr w:type="spellStart"/>
-      <w:r>
-        <w:rPr>
-          <w:rFonts w:ascii="Times New Roman" w:hAnsi="Times New Roman" w:cs="Times New Roman"/>
-          <w:sz w:val="24"/>
-          <w:szCs w:val="24"/>
-        </w:rPr>
-        <w:t>нікомидійської</w:t>
-      </w:r>
-      <w:proofErr w:type="spellEnd"/>
+      <w:r>
+        <w:rPr>
+          <w:rFonts w:ascii="Times New Roman" w:hAnsi="Times New Roman" w:cs="Times New Roman"/>
+          <w:sz w:val="24"/>
+          <w:szCs w:val="24"/>
+        </w:rPr>
+        <w:t>мч</w:t>
+      </w:r>
+      <w:r>
+        <w:rPr>
+          <w:rFonts w:ascii="Times New Roman" w:hAnsi="Times New Roman" w:cs="Times New Roman"/>
+          <w:sz w:val="24"/>
+          <w:szCs w:val="24"/>
+        </w:rPr>
+        <w:t>ц</w:t>
+      </w:r>
+      <w:r>
+        <w:rPr>
+          <w:rFonts w:ascii="Times New Roman" w:hAnsi="Times New Roman" w:cs="Times New Roman"/>
+          <w:sz w:val="24"/>
+          <w:szCs w:val="24"/>
+        </w:rPr>
+        <w:t>.</w:t>
+      </w:r>
+      <w:r>
+        <w:rPr>
+          <w:rFonts w:ascii="Times New Roman" w:hAnsi="Times New Roman" w:cs="Times New Roman"/>
+          <w:sz w:val="24"/>
+          <w:szCs w:val="24"/>
+        </w:rPr>
+        <w:t xml:space="preserve"> </w:t>
+      </w:r>
+      <w:r>
+        <w:rPr>
+          <w:rFonts w:ascii="Times New Roman" w:hAnsi="Times New Roman" w:cs="Times New Roman"/>
+          <w:sz w:val="24"/>
+          <w:szCs w:val="24"/>
+        </w:rPr>
+        <w:t>Юліанії нікомидійської</w:t>
+      </w:r>
     </w:p>
     <w:p>
       <w:pPr>
@@ -552,9 +342,8 @@
           <w:sz w:val="24"/>
           <w:szCs w:val="24"/>
         </w:rPr>
-        <w:t xml:space="preserve"> Готуйся, </w:t>
-      </w:r>
-      <w:proofErr w:type="spellStart"/>
+        <w:t xml:space="preserve"> </w:t>
+      </w:r>
       <w:r>
         <w:rPr>
           <w:rFonts w:ascii="Times New Roman" w:eastAsia="Times New Roman" w:hAnsi="Times New Roman" w:cs="Times New Roman"/>
@@ -563,89 +352,12 @@
           <w:sz w:val="24"/>
           <w:szCs w:val="24"/>
         </w:rPr>
-        <w:t>Вифлеєме</w:t>
-      </w:r>
-      <w:proofErr w:type="spellEnd"/>
-      <w:r>
-        <w:rPr>
-          <w:rFonts w:ascii="Times New Roman" w:eastAsia="Times New Roman" w:hAnsi="Times New Roman" w:cs="Times New Roman"/>
-          <w:color w:val="333333"/>
-          <w:position w:val="0"/>
-          <w:sz w:val="24"/>
-          <w:szCs w:val="24"/>
-        </w:rPr>
-        <w:t xml:space="preserve">, розкрийся всім, </w:t>
-      </w:r>
-      <w:proofErr w:type="spellStart"/>
-      <w:r>
-        <w:rPr>
-          <w:rFonts w:ascii="Times New Roman" w:eastAsia="Times New Roman" w:hAnsi="Times New Roman" w:cs="Times New Roman"/>
-          <w:color w:val="333333"/>
-          <w:position w:val="0"/>
-          <w:sz w:val="24"/>
-          <w:szCs w:val="24"/>
-        </w:rPr>
-        <w:t>Єдеме</w:t>
-      </w:r>
-      <w:proofErr w:type="spellEnd"/>
-      <w:r>
-        <w:rPr>
-          <w:rFonts w:ascii="Times New Roman" w:eastAsia="Times New Roman" w:hAnsi="Times New Roman" w:cs="Times New Roman"/>
-          <w:color w:val="333333"/>
-          <w:position w:val="0"/>
-          <w:sz w:val="24"/>
-          <w:szCs w:val="24"/>
-        </w:rPr>
-        <w:t xml:space="preserve">,* красуйся, Євфрате,* бо дерево життя в вертепі розквітнуло від Діви.* Її лоно раєм </w:t>
-      </w:r>
-      <w:proofErr w:type="spellStart"/>
-      <w:r>
-        <w:rPr>
-          <w:rFonts w:ascii="Times New Roman" w:eastAsia="Times New Roman" w:hAnsi="Times New Roman" w:cs="Times New Roman"/>
-          <w:color w:val="333333"/>
-          <w:position w:val="0"/>
-          <w:sz w:val="24"/>
-          <w:szCs w:val="24"/>
-        </w:rPr>
-        <w:t>мисленним</w:t>
-      </w:r>
-      <w:proofErr w:type="spellEnd"/>
-      <w:r>
-        <w:rPr>
-          <w:rFonts w:ascii="Times New Roman" w:eastAsia="Times New Roman" w:hAnsi="Times New Roman" w:cs="Times New Roman"/>
-          <w:color w:val="333333"/>
-          <w:position w:val="0"/>
-          <w:sz w:val="24"/>
-          <w:szCs w:val="24"/>
-        </w:rPr>
-        <w:t xml:space="preserve"> явилось, в якому – божественний сад.* 3 нього ївши будемо жити – і не як Адам помремо.* Христос </w:t>
-      </w:r>
-      <w:proofErr w:type="spellStart"/>
-      <w:r>
-        <w:rPr>
-          <w:rFonts w:ascii="Times New Roman" w:eastAsia="Times New Roman" w:hAnsi="Times New Roman" w:cs="Times New Roman"/>
-          <w:color w:val="333333"/>
-          <w:position w:val="0"/>
-          <w:sz w:val="24"/>
-          <w:szCs w:val="24"/>
-        </w:rPr>
-        <w:t>раждається</w:t>
-      </w:r>
-      <w:proofErr w:type="spellEnd"/>
-      <w:r>
-        <w:rPr>
-          <w:rFonts w:ascii="Times New Roman" w:eastAsia="Times New Roman" w:hAnsi="Times New Roman" w:cs="Times New Roman"/>
-          <w:color w:val="333333"/>
-          <w:position w:val="0"/>
-          <w:sz w:val="24"/>
-          <w:szCs w:val="24"/>
-        </w:rPr>
-        <w:t>, щоб оновити упалий колись образ.</w:t>
-      </w:r>
-    </w:p>
-    <w:p>
-      <w:pPr>
-        <w:pStyle w:val="a5"/>
+        <w:t>Готу́йся, Вифлеє́ме, розкри́йся всім, Єде́ме,* красу́йся, Євфра́те,* бо де́рево життя́ в верте́пі розкві́тнуло від Ді́ви.* Її́ ло́но ра́єм ми́сленним яви́лось, в яко́му – боже́ственний сад.* 3 ньо́го ї́вши, бу́демо жи́ти – і не, як Ада́м, помре́мо.* Христо́с ражда́ється, щоб онови́ти упа́лий коли́сь о́браз.</w:t>
+      </w:r>
+    </w:p>
+    <w:p>
+      <w:pPr>
+        <w:pStyle w:val="NormalWeb"/>
         <w:ind w:left="0" w:hanging="2"/>
         <w:rPr>
           <w:rFonts w:cs="Times New Roman"/>
@@ -668,48 +380,20 @@
           <w:color w:val="333333"/>
           <w:position w:val="0"/>
         </w:rPr>
-        <w:t xml:space="preserve"> Діва днесь гряде, щоб невимовно родити у вертепі </w:t>
-      </w:r>
-      <w:proofErr w:type="spellStart"/>
+        <w:t xml:space="preserve"> </w:t>
+      </w:r>
       <w:r>
         <w:rPr>
           <w:rFonts w:cs="Times New Roman"/>
           <w:color w:val="333333"/>
           <w:position w:val="0"/>
         </w:rPr>
-        <w:t>превічне</w:t>
-      </w:r>
-      <w:proofErr w:type="spellEnd"/>
-      <w:r>
-        <w:rPr>
-          <w:rFonts w:cs="Times New Roman"/>
-          <w:color w:val="333333"/>
-          <w:position w:val="0"/>
-        </w:rPr>
-        <w:t xml:space="preserve"> Слово.* Радій, </w:t>
-      </w:r>
-      <w:proofErr w:type="spellStart"/>
-      <w:r>
-        <w:rPr>
-          <w:rFonts w:cs="Times New Roman"/>
-          <w:color w:val="333333"/>
-          <w:position w:val="0"/>
-        </w:rPr>
-        <w:t>вселенно</w:t>
-      </w:r>
-      <w:proofErr w:type="spellEnd"/>
-      <w:r>
-        <w:rPr>
-          <w:rFonts w:cs="Times New Roman"/>
-          <w:color w:val="333333"/>
-          <w:position w:val="0"/>
-        </w:rPr>
-        <w:t>, почувши це,* прослав з ангелами й пастирями* того, що хоче явитися дитям малим – превічного Бога. </w:t>
-      </w:r>
-    </w:p>
-    <w:p>
-      <w:pPr>
-        <w:pStyle w:val="1"/>
+        <w:t>Ді́ва днесь гряде́, щоб невимо́вно роди́ти у верте́пі предві́чне Сло́во.* Раді́й, вселе́нно, почу́вши це,* просла́в з а́нгелами й па́стирями* Того́, що хо́че яви́тися дитя́м мали́м – предві́чного Бо́га.</w:t>
+      </w:r>
+    </w:p>
+    <w:p>
+      <w:pPr>
+        <w:pStyle w:val="Heading1"/>
         <w:ind w:left="0" w:hanging="2"/>
         <w:rPr>
           <w:rFonts w:ascii="Times New Roman" w:hAnsi="Times New Roman" w:cs="Times New Roman"/>
@@ -733,16 +417,22 @@
         </w:rPr>
         <w:t xml:space="preserve"> </w:t>
       </w:r>
-      <w:proofErr w:type="spellStart"/>
-      <w:r>
-        <w:rPr>
-          <w:rFonts w:ascii="Times New Roman" w:hAnsi="Times New Roman" w:cs="Times New Roman"/>
-          <w:sz w:val="24"/>
-          <w:szCs w:val="24"/>
-        </w:rPr>
-        <w:t>влмуч</w:t>
-      </w:r>
-      <w:proofErr w:type="spellEnd"/>
+      <w:r>
+        <w:rPr>
+          <w:rFonts w:ascii="Times New Roman" w:hAnsi="Times New Roman" w:cs="Times New Roman"/>
+          <w:sz w:val="24"/>
+          <w:szCs w:val="24"/>
+        </w:rPr>
+        <w:t>влмч</w:t>
+      </w:r>
+      <w:r>
+        <w:rPr>
+          <w:rFonts w:ascii="Times New Roman" w:hAnsi="Times New Roman" w:cs="Times New Roman"/>
+          <w:sz w:val="24"/>
+          <w:szCs w:val="24"/>
+        </w:rPr>
+        <w:t>ц</w:t>
+      </w:r>
       <w:r>
         <w:rPr>
           <w:rFonts w:ascii="Times New Roman" w:hAnsi="Times New Roman" w:cs="Times New Roman"/>
@@ -787,9 +477,8 @@
           <w:sz w:val="24"/>
           <w:szCs w:val="24"/>
         </w:rPr>
-        <w:t xml:space="preserve"> Готуйся, </w:t>
-      </w:r>
-      <w:proofErr w:type="spellStart"/>
+        <w:t xml:space="preserve"> </w:t>
+      </w:r>
       <w:r>
         <w:rPr>
           <w:rFonts w:ascii="Times New Roman" w:eastAsia="Times New Roman" w:hAnsi="Times New Roman" w:cs="Times New Roman"/>
@@ -798,89 +487,12 @@
           <w:sz w:val="24"/>
           <w:szCs w:val="24"/>
         </w:rPr>
-        <w:t>Вифлеєме</w:t>
-      </w:r>
-      <w:proofErr w:type="spellEnd"/>
-      <w:r>
-        <w:rPr>
-          <w:rFonts w:ascii="Times New Roman" w:eastAsia="Times New Roman" w:hAnsi="Times New Roman" w:cs="Times New Roman"/>
-          <w:color w:val="333333"/>
-          <w:position w:val="0"/>
-          <w:sz w:val="24"/>
-          <w:szCs w:val="24"/>
-        </w:rPr>
-        <w:t xml:space="preserve">, розкрийся всім, </w:t>
-      </w:r>
-      <w:proofErr w:type="spellStart"/>
-      <w:r>
-        <w:rPr>
-          <w:rFonts w:ascii="Times New Roman" w:eastAsia="Times New Roman" w:hAnsi="Times New Roman" w:cs="Times New Roman"/>
-          <w:color w:val="333333"/>
-          <w:position w:val="0"/>
-          <w:sz w:val="24"/>
-          <w:szCs w:val="24"/>
-        </w:rPr>
-        <w:t>Єдеме</w:t>
-      </w:r>
-      <w:proofErr w:type="spellEnd"/>
-      <w:r>
-        <w:rPr>
-          <w:rFonts w:ascii="Times New Roman" w:eastAsia="Times New Roman" w:hAnsi="Times New Roman" w:cs="Times New Roman"/>
-          <w:color w:val="333333"/>
-          <w:position w:val="0"/>
-          <w:sz w:val="24"/>
-          <w:szCs w:val="24"/>
-        </w:rPr>
-        <w:t xml:space="preserve">,* красуйся, Євфрате,* бо дерево життя в вертепі розквітнуло від Діви.* Її лоно раєм </w:t>
-      </w:r>
-      <w:proofErr w:type="spellStart"/>
-      <w:r>
-        <w:rPr>
-          <w:rFonts w:ascii="Times New Roman" w:eastAsia="Times New Roman" w:hAnsi="Times New Roman" w:cs="Times New Roman"/>
-          <w:color w:val="333333"/>
-          <w:position w:val="0"/>
-          <w:sz w:val="24"/>
-          <w:szCs w:val="24"/>
-        </w:rPr>
-        <w:t>мисленним</w:t>
-      </w:r>
-      <w:proofErr w:type="spellEnd"/>
-      <w:r>
-        <w:rPr>
-          <w:rFonts w:ascii="Times New Roman" w:eastAsia="Times New Roman" w:hAnsi="Times New Roman" w:cs="Times New Roman"/>
-          <w:color w:val="333333"/>
-          <w:position w:val="0"/>
-          <w:sz w:val="24"/>
-          <w:szCs w:val="24"/>
-        </w:rPr>
-        <w:t xml:space="preserve"> явилось, в якому – божественний сад.* 3 нього ївши будемо жити – і не як Адам помремо.* Христос </w:t>
-      </w:r>
-      <w:proofErr w:type="spellStart"/>
-      <w:r>
-        <w:rPr>
-          <w:rFonts w:ascii="Times New Roman" w:eastAsia="Times New Roman" w:hAnsi="Times New Roman" w:cs="Times New Roman"/>
-          <w:color w:val="333333"/>
-          <w:position w:val="0"/>
-          <w:sz w:val="24"/>
-          <w:szCs w:val="24"/>
-        </w:rPr>
-        <w:t>раждається</w:t>
-      </w:r>
-      <w:proofErr w:type="spellEnd"/>
-      <w:r>
-        <w:rPr>
-          <w:rFonts w:ascii="Times New Roman" w:eastAsia="Times New Roman" w:hAnsi="Times New Roman" w:cs="Times New Roman"/>
-          <w:color w:val="333333"/>
-          <w:position w:val="0"/>
-          <w:sz w:val="24"/>
-          <w:szCs w:val="24"/>
-        </w:rPr>
-        <w:t>, щоб оновити упалий колись образ.</w:t>
-      </w:r>
-    </w:p>
-    <w:p>
-      <w:pPr>
-        <w:pStyle w:val="a5"/>
+        <w:t>Готу́йся, Вифлеє́ме, розкри́йся всім, Єде́ме,* красу́йся, Євфра́те,* бо де́рево життя́ в верте́пі розкві́тнуло від Ді́ви.* Її́ ло́но ра́єм ми́сленним яви́лось, в яко́му – боже́ственний сад.* 3 ньо́го ї́вши, бу́демо жи́ти – і не, як Ада́м, помре́мо.* Христо́с ражда́ється, щоб онови́ти упа́лий коли́сь о́браз.</w:t>
+      </w:r>
+    </w:p>
+    <w:p>
+      <w:pPr>
+        <w:pStyle w:val="NormalWeb"/>
         <w:ind w:left="0" w:hanging="2"/>
         <w:rPr>
           <w:rFonts w:cs="Times New Roman"/>
@@ -903,48 +515,20 @@
           <w:color w:val="333333"/>
           <w:position w:val="0"/>
         </w:rPr>
-        <w:t xml:space="preserve"> Діва днесь гряде, щоб невимовно родити у вертепі </w:t>
-      </w:r>
-      <w:proofErr w:type="spellStart"/>
+        <w:t xml:space="preserve"> </w:t>
+      </w:r>
       <w:r>
         <w:rPr>
           <w:rFonts w:cs="Times New Roman"/>
           <w:color w:val="333333"/>
           <w:position w:val="0"/>
         </w:rPr>
-        <w:t>превічне</w:t>
-      </w:r>
-      <w:proofErr w:type="spellEnd"/>
-      <w:r>
-        <w:rPr>
-          <w:rFonts w:cs="Times New Roman"/>
-          <w:color w:val="333333"/>
-          <w:position w:val="0"/>
-        </w:rPr>
-        <w:t xml:space="preserve"> Слово.* Радій, </w:t>
-      </w:r>
-      <w:proofErr w:type="spellStart"/>
-      <w:r>
-        <w:rPr>
-          <w:rFonts w:cs="Times New Roman"/>
-          <w:color w:val="333333"/>
-          <w:position w:val="0"/>
-        </w:rPr>
-        <w:t>вселенно</w:t>
-      </w:r>
-      <w:proofErr w:type="spellEnd"/>
-      <w:r>
-        <w:rPr>
-          <w:rFonts w:cs="Times New Roman"/>
-          <w:color w:val="333333"/>
-          <w:position w:val="0"/>
-        </w:rPr>
-        <w:t>, почувши це,* прослав з ангелами й пастирями* того, що хоче явитися дитям малим – превічного Бога. </w:t>
-      </w:r>
-    </w:p>
-    <w:p>
-      <w:pPr>
-        <w:pStyle w:val="1"/>
+        <w:t>Ді́ва днесь гряде́, щоб невимо́вно роди́ти у верте́пі предві́чне Сло́во.* Раді́й, вселе́нно, почу́вши це,* просла́в з а́нгелами й па́стирями* Того́, що хо́че яви́тися дитя́м мали́м – предві́чного Бо́га.</w:t>
+      </w:r>
+    </w:p>
+    <w:p>
+      <w:pPr>
+        <w:pStyle w:val="Heading1"/>
         <w:ind w:left="0" w:hanging="2"/>
         <w:rPr>
           <w:rFonts w:ascii="Times New Roman" w:hAnsi="Times New Roman" w:cs="Times New Roman"/>
@@ -1012,9 +596,8 @@
           <w:sz w:val="24"/>
           <w:szCs w:val="24"/>
         </w:rPr>
-        <w:t xml:space="preserve"> Готуйся, </w:t>
-      </w:r>
-      <w:proofErr w:type="spellStart"/>
+        <w:t xml:space="preserve"> </w:t>
+      </w:r>
       <w:r>
         <w:rPr>
           <w:rFonts w:ascii="Times New Roman" w:eastAsia="Times New Roman" w:hAnsi="Times New Roman" w:cs="Times New Roman"/>
@@ -1023,9 +606,8 @@
           <w:sz w:val="24"/>
           <w:szCs w:val="24"/>
         </w:rPr>
-        <w:t>Вифлеєме</w:t>
-      </w:r>
-      <w:proofErr w:type="spellEnd"/>
+        <w:t xml:space="preserve">Готу́йся, Вифлеє́ме, розкри́йся всім, Єде́ме,* красу́йся, Євфра́те,* бо де́рево життя́ в верте́пі розкві́тнуло від Ді́ви.* Її́ ло́но ра́єм ми́сленним яви́лось, в яко́му </w:t>
+      </w:r>
       <w:r>
         <w:rPr>
           <w:rFonts w:ascii="Times New Roman" w:eastAsia="Times New Roman" w:hAnsi="Times New Roman" w:cs="Times New Roman"/>
@@ -1034,89 +616,13 @@
           <w:sz w:val="24"/>
           <w:szCs w:val="24"/>
         </w:rPr>
-        <w:t xml:space="preserve">, розкрийся всім, </w:t>
-      </w:r>
-      <w:proofErr w:type="spellStart"/>
-      <w:r>
-        <w:rPr>
-          <w:rFonts w:ascii="Times New Roman" w:eastAsia="Times New Roman" w:hAnsi="Times New Roman" w:cs="Times New Roman"/>
-          <w:color w:val="333333"/>
-          <w:position w:val="0"/>
-          <w:sz w:val="24"/>
-          <w:szCs w:val="24"/>
-        </w:rPr>
-        <w:t>Єдеме</w:t>
-      </w:r>
-      <w:proofErr w:type="spellEnd"/>
-      <w:r>
-        <w:rPr>
-          <w:rFonts w:ascii="Times New Roman" w:eastAsia="Times New Roman" w:hAnsi="Times New Roman" w:cs="Times New Roman"/>
-          <w:color w:val="333333"/>
-          <w:position w:val="0"/>
-          <w:sz w:val="24"/>
-          <w:szCs w:val="24"/>
-        </w:rPr>
-        <w:t xml:space="preserve">,* красуйся, Євфрате,* бо дерево життя в вертепі розквітнуло від Діви.* Її лоно раєм </w:t>
-      </w:r>
-      <w:proofErr w:type="spellStart"/>
-      <w:r>
-        <w:rPr>
-          <w:rFonts w:ascii="Times New Roman" w:eastAsia="Times New Roman" w:hAnsi="Times New Roman" w:cs="Times New Roman"/>
-          <w:color w:val="333333"/>
-          <w:position w:val="0"/>
-          <w:sz w:val="24"/>
-          <w:szCs w:val="24"/>
-        </w:rPr>
-        <w:t>мисленним</w:t>
-      </w:r>
-      <w:proofErr w:type="spellEnd"/>
-      <w:r>
-        <w:rPr>
-          <w:rFonts w:ascii="Times New Roman" w:eastAsia="Times New Roman" w:hAnsi="Times New Roman" w:cs="Times New Roman"/>
-          <w:color w:val="333333"/>
-          <w:position w:val="0"/>
-          <w:sz w:val="24"/>
-          <w:szCs w:val="24"/>
-        </w:rPr>
-        <w:t xml:space="preserve"> явилось, в якому </w:t>
-      </w:r>
-      <w:r>
-        <w:rPr>
-          <w:rFonts w:ascii="Times New Roman" w:eastAsia="Times New Roman" w:hAnsi="Times New Roman" w:cs="Times New Roman"/>
-          <w:color w:val="333333"/>
-          <w:position w:val="0"/>
-          <w:sz w:val="24"/>
-          <w:szCs w:val="24"/>
-        </w:rPr>
         <w:lastRenderedPageBreak/>
-        <w:t xml:space="preserve">– божественний сад.* 3 нього ївши будемо жити – і не як Адам помремо.* Христос </w:t>
-      </w:r>
-      <w:proofErr w:type="spellStart"/>
-      <w:r>
-        <w:rPr>
-          <w:rFonts w:ascii="Times New Roman" w:eastAsia="Times New Roman" w:hAnsi="Times New Roman" w:cs="Times New Roman"/>
-          <w:color w:val="333333"/>
-          <w:position w:val="0"/>
-          <w:sz w:val="24"/>
-          <w:szCs w:val="24"/>
-        </w:rPr>
-        <w:t>раждається</w:t>
-      </w:r>
-      <w:proofErr w:type="spellEnd"/>
-      <w:r>
-        <w:rPr>
-          <w:rFonts w:ascii="Times New Roman" w:eastAsia="Times New Roman" w:hAnsi="Times New Roman" w:cs="Times New Roman"/>
-          <w:color w:val="333333"/>
-          <w:position w:val="0"/>
-          <w:sz w:val="24"/>
-          <w:szCs w:val="24"/>
-        </w:rPr>
-        <w:t>, щоб оновити упалий колись образ.</w:t>
-      </w:r>
-    </w:p>
-    <w:p>
-      <w:pPr>
-        <w:pStyle w:val="a5"/>
+        <w:t>– боже́ственний сад.* 3 ньо́го ї́вши, бу́демо жи́ти – і не, як Ада́м, помре́мо.* Христо́с ражда́ється, щоб онови́ти упа́лий коли́сь о́браз.</w:t>
+      </w:r>
+    </w:p>
+    <w:p>
+      <w:pPr>
+        <w:pStyle w:val="NormalWeb"/>
         <w:ind w:left="0" w:hanging="2"/>
         <w:rPr>
           <w:rFonts w:cs="Times New Roman"/>
@@ -1139,48 +645,20 @@
           <w:color w:val="333333"/>
           <w:position w:val="0"/>
         </w:rPr>
-        <w:t xml:space="preserve"> Діва днесь гряде, щоб невимовно родити у вертепі </w:t>
-      </w:r>
-      <w:proofErr w:type="spellStart"/>
+        <w:t xml:space="preserve"> </w:t>
+      </w:r>
       <w:r>
         <w:rPr>
           <w:rFonts w:cs="Times New Roman"/>
           <w:color w:val="333333"/>
           <w:position w:val="0"/>
         </w:rPr>
-        <w:t>превічне</w:t>
-      </w:r>
-      <w:proofErr w:type="spellEnd"/>
-      <w:r>
-        <w:rPr>
-          <w:rFonts w:cs="Times New Roman"/>
-          <w:color w:val="333333"/>
-          <w:position w:val="0"/>
-        </w:rPr>
-        <w:t xml:space="preserve"> Слово.* Радій, </w:t>
-      </w:r>
-      <w:proofErr w:type="spellStart"/>
-      <w:r>
-        <w:rPr>
-          <w:rFonts w:cs="Times New Roman"/>
-          <w:color w:val="333333"/>
-          <w:position w:val="0"/>
-        </w:rPr>
-        <w:t>вселенно</w:t>
-      </w:r>
-      <w:proofErr w:type="spellEnd"/>
-      <w:r>
-        <w:rPr>
-          <w:rFonts w:cs="Times New Roman"/>
-          <w:color w:val="333333"/>
-          <w:position w:val="0"/>
-        </w:rPr>
-        <w:t>, почувши це,* прослав з ангелами й пастирями* того, що хоче явитися дитям малим – превічного Бога. </w:t>
-      </w:r>
-    </w:p>
-    <w:p>
-      <w:pPr>
-        <w:pStyle w:val="1"/>
+        <w:t>Ді́ва днесь гряде́, щоб невимо́вно роди́ти у верте́пі предві́чне Сло́во.* Раді́й, вселе́нно, почу́вши це,* просла́в з а́нгелами й па́стирями* Того́, що хо́че яви́тися дитя́м мали́м – предві́чного Бо́га.</w:t>
+      </w:r>
+    </w:p>
+    <w:p>
+      <w:pPr>
+        <w:pStyle w:val="Heading1"/>
         <w:ind w:left="0" w:hanging="2"/>
         <w:rPr>
           <w:rFonts w:ascii="Times New Roman" w:hAnsi="Times New Roman" w:cs="Times New Roman"/>
@@ -1204,23 +682,13 @@
         </w:rPr>
         <w:t xml:space="preserve"> </w:t>
       </w:r>
-      <w:proofErr w:type="spellStart"/>
-      <w:r>
-        <w:rPr>
-          <w:rFonts w:ascii="Times New Roman" w:hAnsi="Times New Roman" w:cs="Times New Roman"/>
-          <w:sz w:val="24"/>
-          <w:szCs w:val="24"/>
-        </w:rPr>
-        <w:t>прпмуч</w:t>
-      </w:r>
-      <w:proofErr w:type="spellEnd"/>
-      <w:r>
-        <w:rPr>
-          <w:rFonts w:ascii="Times New Roman" w:hAnsi="Times New Roman" w:cs="Times New Roman"/>
-          <w:sz w:val="24"/>
-          <w:szCs w:val="24"/>
-        </w:rPr>
-        <w:t>. Євгенії</w:t>
+      <w:r>
+        <w:rPr>
+          <w:rFonts w:ascii="Times New Roman" w:hAnsi="Times New Roman" w:cs="Times New Roman"/>
+          <w:sz w:val="24"/>
+          <w:szCs w:val="24"/>
+        </w:rPr>
+        <w:t>прпмуч. Євгенії</w:t>
       </w:r>
     </w:p>
     <w:p>
@@ -1258,9 +726,8 @@
           <w:sz w:val="24"/>
           <w:szCs w:val="24"/>
         </w:rPr>
-        <w:t xml:space="preserve"> Готуйся, </w:t>
-      </w:r>
-      <w:proofErr w:type="spellStart"/>
+        <w:t xml:space="preserve"> </w:t>
+      </w:r>
       <w:r>
         <w:rPr>
           <w:rFonts w:ascii="Times New Roman" w:eastAsia="Times New Roman" w:hAnsi="Times New Roman" w:cs="Times New Roman"/>
@@ -1269,89 +736,12 @@
           <w:sz w:val="24"/>
           <w:szCs w:val="24"/>
         </w:rPr>
-        <w:t>Вифлеєме</w:t>
-      </w:r>
-      <w:proofErr w:type="spellEnd"/>
-      <w:r>
-        <w:rPr>
-          <w:rFonts w:ascii="Times New Roman" w:eastAsia="Times New Roman" w:hAnsi="Times New Roman" w:cs="Times New Roman"/>
-          <w:color w:val="333333"/>
-          <w:position w:val="0"/>
-          <w:sz w:val="24"/>
-          <w:szCs w:val="24"/>
-        </w:rPr>
-        <w:t xml:space="preserve">, розкрийся всім, </w:t>
-      </w:r>
-      <w:proofErr w:type="spellStart"/>
-      <w:r>
-        <w:rPr>
-          <w:rFonts w:ascii="Times New Roman" w:eastAsia="Times New Roman" w:hAnsi="Times New Roman" w:cs="Times New Roman"/>
-          <w:color w:val="333333"/>
-          <w:position w:val="0"/>
-          <w:sz w:val="24"/>
-          <w:szCs w:val="24"/>
-        </w:rPr>
-        <w:t>Єдеме</w:t>
-      </w:r>
-      <w:proofErr w:type="spellEnd"/>
-      <w:r>
-        <w:rPr>
-          <w:rFonts w:ascii="Times New Roman" w:eastAsia="Times New Roman" w:hAnsi="Times New Roman" w:cs="Times New Roman"/>
-          <w:color w:val="333333"/>
-          <w:position w:val="0"/>
-          <w:sz w:val="24"/>
-          <w:szCs w:val="24"/>
-        </w:rPr>
-        <w:t xml:space="preserve">,* красуйся, Євфрате,* бо дерево життя в вертепі розквітнуло від Діви.* Її лоно раєм </w:t>
-      </w:r>
-      <w:proofErr w:type="spellStart"/>
-      <w:r>
-        <w:rPr>
-          <w:rFonts w:ascii="Times New Roman" w:eastAsia="Times New Roman" w:hAnsi="Times New Roman" w:cs="Times New Roman"/>
-          <w:color w:val="333333"/>
-          <w:position w:val="0"/>
-          <w:sz w:val="24"/>
-          <w:szCs w:val="24"/>
-        </w:rPr>
-        <w:t>мисленним</w:t>
-      </w:r>
-      <w:proofErr w:type="spellEnd"/>
-      <w:r>
-        <w:rPr>
-          <w:rFonts w:ascii="Times New Roman" w:eastAsia="Times New Roman" w:hAnsi="Times New Roman" w:cs="Times New Roman"/>
-          <w:color w:val="333333"/>
-          <w:position w:val="0"/>
-          <w:sz w:val="24"/>
-          <w:szCs w:val="24"/>
-        </w:rPr>
-        <w:t xml:space="preserve"> явилось, в якому – божественний сад.* 3 нього ївши будемо жити – і не як Адам помремо.* Христос </w:t>
-      </w:r>
-      <w:proofErr w:type="spellStart"/>
-      <w:r>
-        <w:rPr>
-          <w:rFonts w:ascii="Times New Roman" w:eastAsia="Times New Roman" w:hAnsi="Times New Roman" w:cs="Times New Roman"/>
-          <w:color w:val="333333"/>
-          <w:position w:val="0"/>
-          <w:sz w:val="24"/>
-          <w:szCs w:val="24"/>
-        </w:rPr>
-        <w:t>раждається</w:t>
-      </w:r>
-      <w:proofErr w:type="spellEnd"/>
-      <w:r>
-        <w:rPr>
-          <w:rFonts w:ascii="Times New Roman" w:eastAsia="Times New Roman" w:hAnsi="Times New Roman" w:cs="Times New Roman"/>
-          <w:color w:val="333333"/>
-          <w:position w:val="0"/>
-          <w:sz w:val="24"/>
-          <w:szCs w:val="24"/>
-        </w:rPr>
-        <w:t>, щоб оновити упалий колись образ.</w:t>
-      </w:r>
-    </w:p>
-    <w:p>
-      <w:pPr>
-        <w:pStyle w:val="a5"/>
+        <w:t>Готу́йся, Вифлеє́ме, розкри́йся всім, Єде́ме,* красу́йся, Євфра́те,* бо де́рево життя́ в верте́пі розкві́тнуло від Ді́ви.* Її́ ло́но ра́єм ми́сленним яви́лось, в яко́му – боже́ственний сад.* 3 ньо́го ї́вши, бу́демо жи́ти – і не, як Ада́м, помре́мо.* Христо́с ражда́ється, щоб онови́ти упа́лий коли́сь о́браз.</w:t>
+      </w:r>
+    </w:p>
+    <w:p>
+      <w:pPr>
+        <w:pStyle w:val="NormalWeb"/>
         <w:ind w:left="0" w:hanging="2"/>
         <w:rPr>
           <w:rFonts w:cs="Times New Roman"/>
@@ -1374,48 +764,20 @@
           <w:color w:val="333333"/>
           <w:position w:val="0"/>
         </w:rPr>
-        <w:t xml:space="preserve"> Діва днесь гряде, щоб невимовно родити у вертепі </w:t>
-      </w:r>
-      <w:proofErr w:type="spellStart"/>
+        <w:t xml:space="preserve"> </w:t>
+      </w:r>
       <w:r>
         <w:rPr>
           <w:rFonts w:cs="Times New Roman"/>
           <w:color w:val="333333"/>
           <w:position w:val="0"/>
         </w:rPr>
-        <w:t>превічне</w:t>
-      </w:r>
-      <w:proofErr w:type="spellEnd"/>
-      <w:r>
-        <w:rPr>
-          <w:rFonts w:cs="Times New Roman"/>
-          <w:color w:val="333333"/>
-          <w:position w:val="0"/>
-        </w:rPr>
-        <w:t xml:space="preserve"> Слово.* Радій, </w:t>
-      </w:r>
-      <w:proofErr w:type="spellStart"/>
-      <w:r>
-        <w:rPr>
-          <w:rFonts w:cs="Times New Roman"/>
-          <w:color w:val="333333"/>
-          <w:position w:val="0"/>
-        </w:rPr>
-        <w:t>вселенно</w:t>
-      </w:r>
-      <w:proofErr w:type="spellEnd"/>
-      <w:r>
-        <w:rPr>
-          <w:rFonts w:cs="Times New Roman"/>
-          <w:color w:val="333333"/>
-          <w:position w:val="0"/>
-        </w:rPr>
-        <w:t>, почувши це,* прослав з ангелами й пастирями* того, що хоче явитися дитям малим – превічного Бога. </w:t>
-      </w:r>
-    </w:p>
-    <w:p>
-      <w:pPr>
-        <w:pStyle w:val="1"/>
+        <w:t>Ді́ва днесь гряде́, щоб невимо́вно роди́ти у верте́пі предві́чне Сло́во.* Раді́й, вселе́нно, почу́вши це,* просла́в з а́нгелами й па́стирями* Того́, що хо́че яви́тися дитя́м мали́м – предві́чного Бо́га.</w:t>
+      </w:r>
+    </w:p>
+    <w:p>
+      <w:pPr>
+        <w:pStyle w:val="Heading1"/>
         <w:ind w:left="0" w:hanging="2"/>
         <w:rPr>
           <w:rFonts w:ascii="Times New Roman" w:hAnsi="Times New Roman" w:cs="Times New Roman"/>
@@ -1450,7 +812,7 @@
     </w:p>
     <w:p>
       <w:pPr>
-        <w:pStyle w:val="a5"/>
+        <w:pStyle w:val="NormalWeb"/>
         <w:ind w:left="0" w:hanging="2"/>
         <w:rPr>
           <w:rFonts w:cs="Times New Roman"/>
@@ -1468,12 +830,18 @@
         <w:rPr>
           <w:rFonts w:cs="Times New Roman"/>
         </w:rPr>
-        <w:t xml:space="preserve"> Різдво Твоє, Христе Боже наш,* засвітило світові світло розуміння:* в ньому бо ті, що звіздам служили, від звізди навчилися* поклонятися Тобі – Сонцю правди,* і пізнавати Тебе – Схід з висоти.* Господи, слава Тобі.</w:t>
-      </w:r>
-    </w:p>
-    <w:p>
-      <w:pPr>
-        <w:pStyle w:val="a5"/>
+        <w:t xml:space="preserve"> </w:t>
+      </w:r>
+      <w:r>
+        <w:rPr>
+          <w:rFonts w:cs="Times New Roman"/>
+        </w:rPr>
+        <w:t>Різдво́ Твоє́, Хри́сте Бо́же наш,* засвіти́ло сві́тові сві́тло розумі́ння:* в ньо́му бо ті, що зві́здам служи́ли, від звізди́ навчи́лися* поклоня́тися Тобі́ – Со́нцю пра́вди,* і пізнава́ти Тебе́ – Схід з висоти́.* Го́споди, сла́ва Тобі́.</w:t>
+      </w:r>
+    </w:p>
+    <w:p>
+      <w:pPr>
+        <w:pStyle w:val="NormalWeb"/>
         <w:ind w:left="0" w:hanging="2"/>
         <w:rPr>
           <w:rFonts w:cs="Times New Roman"/>
@@ -1496,42 +864,14 @@
       </w:r>
       <w:r>
         <w:rPr>
-          <w:rFonts w:cs="Times New Roman"/>
-        </w:rPr>
-        <w:t xml:space="preserve">Діва днесь </w:t>
-      </w:r>
-      <w:proofErr w:type="spellStart"/>
-      <w:r>
-        <w:rPr>
-          <w:rFonts w:cs="Times New Roman"/>
-        </w:rPr>
-        <w:t>преістотного</w:t>
-      </w:r>
-      <w:proofErr w:type="spellEnd"/>
-      <w:r>
-        <w:rPr>
-          <w:rFonts w:cs="Times New Roman"/>
-        </w:rPr>
-        <w:t xml:space="preserve"> родить* і земля вертеп неприступному приносить.* Ангели з пастирями славословлять,* а волхви зо звіздою подорожують,* бо ради нас родилося Дитя мале – </w:t>
-      </w:r>
-      <w:proofErr w:type="spellStart"/>
-      <w:r>
-        <w:rPr>
-          <w:rFonts w:cs="Times New Roman"/>
-        </w:rPr>
-        <w:t>превічний</w:t>
-      </w:r>
-      <w:proofErr w:type="spellEnd"/>
-      <w:r>
-        <w:rPr>
-          <w:rFonts w:cs="Times New Roman"/>
-        </w:rPr>
-        <w:t xml:space="preserve"> Бог.</w:t>
-      </w:r>
-    </w:p>
-    <w:p>
-      <w:pPr>
-        <w:pStyle w:val="1"/>
+          <w:color w:val="000000"/>
+        </w:rPr>
+        <w:t>Ді́ва днесь преісто́тного ро́дить* і земля́ верте́п непристу́пному прино́сить.* А́нгели з па́стирями славосло́влять,* а волхви́ зо звіздо́ю подорожу́ють,* бо ра́ди нас роди́лося дитя́ мале́ – предві́чний Бог.</w:t>
+      </w:r>
+    </w:p>
+    <w:p>
+      <w:pPr>
+        <w:pStyle w:val="Heading1"/>
         <w:ind w:left="0" w:hanging="2"/>
         <w:rPr>
           <w:rFonts w:ascii="Times New Roman" w:hAnsi="Times New Roman" w:cs="Times New Roman"/>
@@ -1561,22 +901,12 @@
           <w:sz w:val="24"/>
           <w:szCs w:val="24"/>
         </w:rPr>
-        <w:t xml:space="preserve">Собор </w:t>
-      </w:r>
-      <w:proofErr w:type="spellStart"/>
-      <w:r>
-        <w:rPr>
-          <w:rFonts w:ascii="Times New Roman" w:hAnsi="Times New Roman" w:cs="Times New Roman"/>
-          <w:sz w:val="24"/>
-          <w:szCs w:val="24"/>
-        </w:rPr>
-        <w:t>пресв.Богородиці</w:t>
-      </w:r>
-      <w:proofErr w:type="spellEnd"/>
-    </w:p>
-    <w:p>
-      <w:pPr>
-        <w:pStyle w:val="a5"/>
+        <w:t>Собор пресв.Богородиці</w:t>
+      </w:r>
+    </w:p>
+    <w:p>
+      <w:pPr>
+        <w:pStyle w:val="NormalWeb"/>
         <w:ind w:left="0" w:hanging="2"/>
         <w:rPr>
           <w:rFonts w:cs="Times New Roman"/>
@@ -1594,12 +924,18 @@
         <w:rPr>
           <w:rFonts w:cs="Times New Roman"/>
         </w:rPr>
-        <w:t xml:space="preserve"> Різдво Твоє, Христе Боже наш,* засвітило світові світло розуміння:* в ньому бо ті, що звіздам служили, від звізди навчилися* поклонятися Тобі – Сонцю правди,* і пізнавати Тебе – Схід з висоти.* Господи, слава Тобі.</w:t>
-      </w:r>
-    </w:p>
-    <w:p>
-      <w:pPr>
-        <w:pStyle w:val="a5"/>
+        <w:t xml:space="preserve"> </w:t>
+      </w:r>
+      <w:r>
+        <w:rPr>
+          <w:rFonts w:cs="Times New Roman"/>
+        </w:rPr>
+        <w:t>Різдво́ Твоє́, Хри́сте Бо́же наш,* засвіти́ло сві́тові сві́тло розумі́ння:* в ньо́му бо ті, що зві́здам служи́ли, від звізди́ навчи́лися* поклоня́тися Тобі́ – Со́нцю пра́вди,* і пізнава́ти Тебе́ – Схід з висоти́.* Го́споди, сла́ва Тобі́.</w:t>
+      </w:r>
+    </w:p>
+    <w:p>
+      <w:pPr>
+        <w:pStyle w:val="NormalWeb"/>
         <w:ind w:left="0" w:hanging="2"/>
         <w:rPr>
           <w:rFonts w:cs="Times New Roman"/>
@@ -1617,26 +953,18 @@
         <w:rPr>
           <w:rFonts w:cs="Times New Roman"/>
         </w:rPr>
-        <w:t xml:space="preserve"> Раніш зірниці від Отця без матері роджений* – на землі без отця днесь воплотився з Тебе.* Тим-то звізда </w:t>
-      </w:r>
-      <w:proofErr w:type="spellStart"/>
-      <w:r>
-        <w:rPr>
-          <w:rFonts w:cs="Times New Roman"/>
-        </w:rPr>
-        <w:t>благовістує</w:t>
-      </w:r>
-      <w:proofErr w:type="spellEnd"/>
-      <w:r>
-        <w:rPr>
-          <w:rFonts w:cs="Times New Roman"/>
-        </w:rPr>
-        <w:t xml:space="preserve"> волхвам,* ангели ж із пастирями оспівують несказанне Різдво Твоє, Благодатная.</w:t>
-      </w:r>
-    </w:p>
-    <w:p>
-      <w:pPr>
-        <w:pStyle w:val="1"/>
+        <w:t xml:space="preserve"> </w:t>
+      </w:r>
+      <w:r>
+        <w:rPr>
+          <w:color w:val="000000"/>
+        </w:rPr>
+        <w:t>Рані́ш зірни́ці від Отця́ без ма́тері ро́джений* – на землі́ без отця́ днесь воплоти́вся з те́бе.* Тим-то звізда́ благовісту́є волхва́м,* а́нгели ж із па́стирями оспі́вують несказа́нне різдво́ твоє́, Благода́тная.</w:t>
+      </w:r>
+    </w:p>
+    <w:p>
+      <w:pPr>
+        <w:pStyle w:val="Heading1"/>
         <w:ind w:left="0" w:hanging="2"/>
         <w:rPr>
           <w:rFonts w:ascii="Times New Roman" w:hAnsi="Times New Roman" w:cs="Times New Roman"/>
@@ -1660,82 +988,26 @@
         </w:rPr>
         <w:t xml:space="preserve"> </w:t>
       </w:r>
-      <w:proofErr w:type="spellStart"/>
-      <w:r>
-        <w:rPr>
-          <w:rFonts w:ascii="Times New Roman" w:hAnsi="Times New Roman" w:cs="Times New Roman"/>
-          <w:sz w:val="24"/>
-          <w:szCs w:val="24"/>
-        </w:rPr>
-        <w:t>Св.ап.первомуч</w:t>
-      </w:r>
-      <w:proofErr w:type="spellEnd"/>
-      <w:r>
-        <w:rPr>
-          <w:rFonts w:ascii="Times New Roman" w:hAnsi="Times New Roman" w:cs="Times New Roman"/>
-          <w:sz w:val="24"/>
-          <w:szCs w:val="24"/>
-        </w:rPr>
-        <w:t xml:space="preserve"> і </w:t>
-      </w:r>
-      <w:proofErr w:type="spellStart"/>
-      <w:r>
-        <w:rPr>
-          <w:rFonts w:ascii="Times New Roman" w:hAnsi="Times New Roman" w:cs="Times New Roman"/>
-          <w:sz w:val="24"/>
-          <w:szCs w:val="24"/>
-        </w:rPr>
-        <w:t>архид.Стефана</w:t>
-      </w:r>
-      <w:proofErr w:type="spellEnd"/>
-      <w:r>
-        <w:rPr>
-          <w:rFonts w:ascii="Times New Roman" w:hAnsi="Times New Roman" w:cs="Times New Roman"/>
-          <w:sz w:val="24"/>
-          <w:szCs w:val="24"/>
-        </w:rPr>
-        <w:t xml:space="preserve">, </w:t>
-      </w:r>
-      <w:proofErr w:type="spellStart"/>
-      <w:r>
-        <w:rPr>
-          <w:rFonts w:ascii="Times New Roman" w:hAnsi="Times New Roman" w:cs="Times New Roman"/>
-          <w:sz w:val="24"/>
-          <w:szCs w:val="24"/>
-        </w:rPr>
-        <w:t>преп.іспов.Теодора</w:t>
-      </w:r>
-      <w:proofErr w:type="spellEnd"/>
-      <w:r>
-        <w:rPr>
-          <w:rFonts w:ascii="Times New Roman" w:hAnsi="Times New Roman" w:cs="Times New Roman"/>
-          <w:sz w:val="24"/>
-          <w:szCs w:val="24"/>
-        </w:rPr>
-        <w:t xml:space="preserve"> </w:t>
-      </w:r>
-      <w:proofErr w:type="spellStart"/>
-      <w:r>
-        <w:rPr>
-          <w:rFonts w:ascii="Times New Roman" w:hAnsi="Times New Roman" w:cs="Times New Roman"/>
-          <w:sz w:val="24"/>
-          <w:szCs w:val="24"/>
-        </w:rPr>
-        <w:t>Начертанного</w:t>
-      </w:r>
-      <w:proofErr w:type="spellEnd"/>
-      <w:r>
-        <w:rPr>
-          <w:rFonts w:ascii="Times New Roman" w:hAnsi="Times New Roman" w:cs="Times New Roman"/>
-          <w:sz w:val="24"/>
-          <w:szCs w:val="24"/>
-        </w:rPr>
-        <w:t>, брата Теофана творця канонів.</w:t>
-      </w:r>
-    </w:p>
-    <w:p>
-      <w:pPr>
-        <w:pStyle w:val="a5"/>
+      <w:r>
+        <w:rPr>
+          <w:rFonts w:ascii="Times New Roman" w:hAnsi="Times New Roman" w:cs="Times New Roman"/>
+          <w:sz w:val="24"/>
+          <w:szCs w:val="24"/>
+        </w:rPr>
+        <w:t>Св.ап.первомуч і архид.Стефана</w:t>
+      </w:r>
+      <w:r>
+        <w:rPr>
+          <w:rFonts w:ascii="Times New Roman" w:hAnsi="Times New Roman" w:cs="Times New Roman"/>
+          <w:sz w:val="24"/>
+          <w:szCs w:val="24"/>
+        </w:rPr>
+        <w:t>, преп.іспов.Теодора Начертанного, брата Теофана творця канонів.</w:t>
+      </w:r>
+    </w:p>
+    <w:p>
+      <w:pPr>
+        <w:pStyle w:val="NormalWeb"/>
         <w:ind w:left="0" w:hanging="2"/>
         <w:rPr>
           <w:rFonts w:cs="Times New Roman"/>
@@ -1753,12 +1025,18 @@
         <w:rPr>
           <w:rFonts w:cs="Times New Roman"/>
         </w:rPr>
-        <w:t xml:space="preserve"> Різдво Твоє, Христе Боже наш,* засвітило світові світло розуміння:* в ньому бо ті, що звіздам служили, від звізди навчилися* поклонятися Тобі – Сонцю правди,* і пізнавати Тебе – Схід з висоти.* Господи, слава Тобі.</w:t>
-      </w:r>
-    </w:p>
-    <w:p>
-      <w:pPr>
-        <w:pStyle w:val="a5"/>
+        <w:t xml:space="preserve"> </w:t>
+      </w:r>
+      <w:r>
+        <w:rPr>
+          <w:rFonts w:cs="Times New Roman"/>
+        </w:rPr>
+        <w:t>Різдво́ Твоє́, Хри́сте Бо́же наш,* засвіти́ло сві́тові сві́тло розумі́ння:* в ньо́му бо ті, що зві́здам служи́ли, від звізди́ навчи́лися* поклоня́тися Тобі́ – Со́нцю пра́вди,* і пізнава́ти Тебе́ – Схід з висоти́.* Го́споди, сла́ва Тобі́.</w:t>
+      </w:r>
+    </w:p>
+    <w:p>
+      <w:pPr>
+        <w:pStyle w:val="NormalWeb"/>
         <w:ind w:left="0" w:hanging="2"/>
         <w:rPr>
           <w:rFonts w:cs="Times New Roman"/>
@@ -1782,42 +1060,14 @@
       </w:r>
       <w:r>
         <w:rPr>
-          <w:rFonts w:cs="Times New Roman"/>
-        </w:rPr>
-        <w:t xml:space="preserve">Діва днесь </w:t>
-      </w:r>
-      <w:proofErr w:type="spellStart"/>
-      <w:r>
-        <w:rPr>
-          <w:rFonts w:cs="Times New Roman"/>
-        </w:rPr>
-        <w:t>преістотного</w:t>
-      </w:r>
-      <w:proofErr w:type="spellEnd"/>
-      <w:r>
-        <w:rPr>
-          <w:rFonts w:cs="Times New Roman"/>
-        </w:rPr>
-        <w:t xml:space="preserve"> родить* і земля вертеп неприступному приносить.* Ангели з пастирями славословлять,* а волхви зо звіздою подорожують,* бо ради нас родилося Дитя мале – </w:t>
-      </w:r>
-      <w:proofErr w:type="spellStart"/>
-      <w:r>
-        <w:rPr>
-          <w:rFonts w:cs="Times New Roman"/>
-        </w:rPr>
-        <w:t>превічний</w:t>
-      </w:r>
-      <w:proofErr w:type="spellEnd"/>
-      <w:r>
-        <w:rPr>
-          <w:rFonts w:cs="Times New Roman"/>
-        </w:rPr>
-        <w:t xml:space="preserve"> Бог.</w:t>
-      </w:r>
-    </w:p>
-    <w:p>
-      <w:pPr>
-        <w:pStyle w:val="1"/>
+          <w:color w:val="000000"/>
+        </w:rPr>
+        <w:t>Ді́ва днесь преісто́тного ро́дить* і земля́ верте́п непристу́пному прино́сить.* А́нгели з па́стирями славосло́влять,* а волхви́ зо звіздо́ю подорожу́ють,* бо ра́ди нас роди́лося дитя́ мале́ – предві́чний Бог.</w:t>
+      </w:r>
+    </w:p>
+    <w:p>
+      <w:pPr>
+        <w:pStyle w:val="Heading1"/>
         <w:ind w:left="0" w:hanging="2"/>
         <w:rPr>
           <w:rFonts w:ascii="Times New Roman" w:hAnsi="Times New Roman" w:cs="Times New Roman"/>
@@ -1841,38 +1091,18 @@
         </w:rPr>
         <w:t xml:space="preserve"> </w:t>
       </w:r>
-      <w:proofErr w:type="spellStart"/>
-      <w:r>
-        <w:rPr>
-          <w:rFonts w:ascii="Times New Roman" w:hAnsi="Times New Roman" w:cs="Times New Roman"/>
-          <w:sz w:val="24"/>
-          <w:szCs w:val="24"/>
-        </w:rPr>
-        <w:t>Мучч</w:t>
-      </w:r>
-      <w:proofErr w:type="spellEnd"/>
-      <w:r>
-        <w:rPr>
-          <w:rFonts w:ascii="Times New Roman" w:hAnsi="Times New Roman" w:cs="Times New Roman"/>
-          <w:sz w:val="24"/>
-          <w:szCs w:val="24"/>
-        </w:rPr>
-        <w:t xml:space="preserve">. 2000, спалених в </w:t>
-      </w:r>
-      <w:proofErr w:type="spellStart"/>
-      <w:r>
-        <w:rPr>
-          <w:rFonts w:ascii="Times New Roman" w:hAnsi="Times New Roman" w:cs="Times New Roman"/>
-          <w:sz w:val="24"/>
-          <w:szCs w:val="24"/>
-        </w:rPr>
-        <w:t>Нікомидії</w:t>
-      </w:r>
-      <w:proofErr w:type="spellEnd"/>
-    </w:p>
-    <w:p>
-      <w:pPr>
-        <w:pStyle w:val="a5"/>
+      <w:r>
+        <w:rPr>
+          <w:rFonts w:ascii="Times New Roman" w:hAnsi="Times New Roman" w:cs="Times New Roman"/>
+          <w:sz w:val="24"/>
+          <w:szCs w:val="24"/>
+        </w:rPr>
+        <w:t>Мучч. 2000, спалених в Нікомидії</w:t>
+      </w:r>
+    </w:p>
+    <w:p>
+      <w:pPr>
+        <w:pStyle w:val="NormalWeb"/>
         <w:ind w:left="0" w:hanging="2"/>
         <w:rPr>
           <w:rFonts w:cs="Times New Roman"/>
@@ -1890,12 +1120,18 @@
         <w:rPr>
           <w:rFonts w:cs="Times New Roman"/>
         </w:rPr>
-        <w:t xml:space="preserve"> Різдво Твоє, Христе Боже наш,* засвітило світові світло розуміння:* в ньому бо ті, що звіздам служили, від звізди навчилися* поклонятися Тобі – Сонцю правди,* і пізнавати Тебе – Схід з висоти.* Господи, слава Тобі.</w:t>
-      </w:r>
-    </w:p>
-    <w:p>
-      <w:pPr>
-        <w:pStyle w:val="a5"/>
+        <w:t xml:space="preserve"> </w:t>
+      </w:r>
+      <w:r>
+        <w:rPr>
+          <w:rFonts w:cs="Times New Roman"/>
+        </w:rPr>
+        <w:t>Різдво́ Твоє́, Хри́сте Бо́же наш,* засвіти́ло сві́тові сві́тло розумі́ння:* в ньо́му бо ті, що зві́здам служи́ли, від звізди́ навчи́лися* поклоня́тися Тобі́ – Со́нцю пра́вди,* і пізнава́ти Тебе́ – Схід з висоти́.* Го́споди, сла́ва Тобі́.</w:t>
+      </w:r>
+    </w:p>
+    <w:p>
+      <w:pPr>
+        <w:pStyle w:val="NormalWeb"/>
         <w:ind w:left="0" w:hanging="2"/>
         <w:rPr>
           <w:rFonts w:cs="Times New Roman"/>
@@ -1918,42 +1154,14 @@
       </w:r>
       <w:r>
         <w:rPr>
-          <w:rFonts w:cs="Times New Roman"/>
-        </w:rPr>
-        <w:t xml:space="preserve">Діва днесь </w:t>
-      </w:r>
-      <w:proofErr w:type="spellStart"/>
-      <w:r>
-        <w:rPr>
-          <w:rFonts w:cs="Times New Roman"/>
-        </w:rPr>
-        <w:t>преістотного</w:t>
-      </w:r>
-      <w:proofErr w:type="spellEnd"/>
-      <w:r>
-        <w:rPr>
-          <w:rFonts w:cs="Times New Roman"/>
-        </w:rPr>
-        <w:t xml:space="preserve"> родить* і земля вертеп неприступному приносить.* Ангели з пастирями славословлять,* а волхви зо звіздою подорожують,* бо ради нас родилося Дитя мале – </w:t>
-      </w:r>
-      <w:proofErr w:type="spellStart"/>
-      <w:r>
-        <w:rPr>
-          <w:rFonts w:cs="Times New Roman"/>
-        </w:rPr>
-        <w:t>превічний</w:t>
-      </w:r>
-      <w:proofErr w:type="spellEnd"/>
-      <w:r>
-        <w:rPr>
-          <w:rFonts w:cs="Times New Roman"/>
-        </w:rPr>
-        <w:t xml:space="preserve"> Бог.</w:t>
-      </w:r>
-    </w:p>
-    <w:p>
-      <w:pPr>
-        <w:pStyle w:val="1"/>
+          <w:color w:val="000000"/>
+        </w:rPr>
+        <w:t>Ді́ва днесь преісто́тного ро́дить* і земля́ верте́п непристу́пному прино́сить.* А́нгели з па́стирями славосло́влять,* а волхви́ зо звіздо́ю подорожу́ють,* бо ра́ди нас роди́лося дитя́ мале́ – предві́чний Бог.</w:t>
+      </w:r>
+    </w:p>
+    <w:p>
+      <w:pPr>
+        <w:pStyle w:val="Heading1"/>
         <w:ind w:left="0" w:hanging="2"/>
         <w:rPr>
           <w:rFonts w:ascii="Times New Roman" w:hAnsi="Times New Roman" w:cs="Times New Roman"/>
@@ -1983,30 +1191,12 @@
           <w:sz w:val="24"/>
           <w:szCs w:val="24"/>
         </w:rPr>
-        <w:t xml:space="preserve">Святих младенців, яких через Христа Ірод убив у </w:t>
-      </w:r>
-      <w:proofErr w:type="spellStart"/>
-      <w:r>
-        <w:rPr>
-          <w:rFonts w:ascii="Times New Roman" w:hAnsi="Times New Roman" w:cs="Times New Roman"/>
-          <w:sz w:val="24"/>
-          <w:szCs w:val="24"/>
-        </w:rPr>
-        <w:t>Вифлеємі</w:t>
-      </w:r>
-      <w:proofErr w:type="spellEnd"/>
-      <w:r>
-        <w:rPr>
-          <w:rFonts w:ascii="Times New Roman" w:hAnsi="Times New Roman" w:cs="Times New Roman"/>
-          <w:sz w:val="24"/>
-          <w:szCs w:val="24"/>
-        </w:rPr>
-        <w:t xml:space="preserve"> Юдейськім.</w:t>
-      </w:r>
-    </w:p>
-    <w:p>
-      <w:pPr>
-        <w:pStyle w:val="a5"/>
+        <w:t>Святих младенців, яких через Христа Ірод убив у Вифлеємі Юдейськім.</w:t>
+      </w:r>
+    </w:p>
+    <w:p>
+      <w:pPr>
+        <w:pStyle w:val="NormalWeb"/>
         <w:ind w:left="0" w:hanging="2"/>
         <w:rPr>
           <w:rFonts w:cs="Times New Roman"/>
@@ -2024,12 +1214,18 @@
         <w:rPr>
           <w:rFonts w:cs="Times New Roman"/>
         </w:rPr>
-        <w:t xml:space="preserve"> Різдво Твоє, Христе Боже наш,* засвітило світові світло розуміння:* в ньому бо ті, що звіздам служили, від звізди навчилися* поклонятися Тобі – Сонцю правди,* і пізнавати Тебе – Схід з висоти.* Господи, слава Тобі.</w:t>
-      </w:r>
-    </w:p>
-    <w:p>
-      <w:pPr>
-        <w:pStyle w:val="a5"/>
+        <w:t xml:space="preserve"> </w:t>
+      </w:r>
+      <w:r>
+        <w:rPr>
+          <w:rFonts w:cs="Times New Roman"/>
+        </w:rPr>
+        <w:t>Різдво́ Твоє́, Хри́сте Бо́же наш,* засвіти́ло сві́тові сві́тло розумі́ння:* в ньо́му бо ті, що зві́здам служи́ли, від звізди́ навчи́лися* поклоня́тися Тобі́ – Со́нцю пра́вди,* і пізнава́ти Тебе́ – Схід з висоти́.* Го́споди, сла́ва Тобі́.</w:t>
+      </w:r>
+    </w:p>
+    <w:p>
+      <w:pPr>
+        <w:pStyle w:val="NormalWeb"/>
         <w:ind w:left="0" w:hanging="2"/>
         <w:rPr>
           <w:rFonts w:cs="Times New Roman"/>
@@ -2052,42 +1248,14 @@
       </w:r>
       <w:r>
         <w:rPr>
-          <w:rFonts w:cs="Times New Roman"/>
-        </w:rPr>
-        <w:t xml:space="preserve">Діва днесь </w:t>
-      </w:r>
-      <w:proofErr w:type="spellStart"/>
-      <w:r>
-        <w:rPr>
-          <w:rFonts w:cs="Times New Roman"/>
-        </w:rPr>
-        <w:t>преістотного</w:t>
-      </w:r>
-      <w:proofErr w:type="spellEnd"/>
-      <w:r>
-        <w:rPr>
-          <w:rFonts w:cs="Times New Roman"/>
-        </w:rPr>
-        <w:t xml:space="preserve"> родить* і земля вертеп неприступному приносить.* Ангели з пастирями славословлять,* а волхви зо звіздою подорожують,* бо ради нас родилося Дитя мале – </w:t>
-      </w:r>
-      <w:proofErr w:type="spellStart"/>
-      <w:r>
-        <w:rPr>
-          <w:rFonts w:cs="Times New Roman"/>
-        </w:rPr>
-        <w:t>превічний</w:t>
-      </w:r>
-      <w:proofErr w:type="spellEnd"/>
-      <w:r>
-        <w:rPr>
-          <w:rFonts w:cs="Times New Roman"/>
-        </w:rPr>
-        <w:t xml:space="preserve"> Бог.</w:t>
-      </w:r>
-    </w:p>
-    <w:p>
-      <w:pPr>
-        <w:pStyle w:val="1"/>
+          <w:color w:val="000000"/>
+        </w:rPr>
+        <w:t>Ді́ва днесь преісто́тного ро́дить* і земля́ верте́п непристу́пному прино́сить.* А́нгели з па́стирями славосло́влять,* а волхви́ зо звіздо́ю подорожу́ють,* бо ра́ди нас роди́лося дитя́ мале́ – предві́чний Бог.</w:t>
+      </w:r>
+    </w:p>
+    <w:p>
+      <w:pPr>
+        <w:pStyle w:val="Heading1"/>
         <w:ind w:left="0" w:hanging="2"/>
         <w:rPr>
           <w:rFonts w:ascii="Times New Roman" w:hAnsi="Times New Roman" w:cs="Times New Roman"/>
@@ -2117,18 +1285,8 @@
           <w:sz w:val="24"/>
           <w:szCs w:val="24"/>
         </w:rPr>
-        <w:t xml:space="preserve">Муч. </w:t>
-      </w:r>
-      <w:proofErr w:type="spellStart"/>
-      <w:r>
-        <w:rPr>
-          <w:rFonts w:ascii="Times New Roman" w:hAnsi="Times New Roman" w:cs="Times New Roman"/>
-          <w:sz w:val="24"/>
-          <w:szCs w:val="24"/>
-        </w:rPr>
-        <w:t>Анісії</w:t>
-      </w:r>
-      <w:proofErr w:type="spellEnd"/>
+        <w:t>Муч. Анісії</w:t>
+      </w:r>
       <w:r>
         <w:rPr>
           <w:rFonts w:ascii="Times New Roman" w:hAnsi="Times New Roman" w:cs="Times New Roman"/>
@@ -2137,7 +1295,6 @@
         </w:rPr>
         <w:t xml:space="preserve">, </w:t>
       </w:r>
-      <w:proofErr w:type="spellStart"/>
       <w:r>
         <w:rPr>
           <w:rFonts w:ascii="Times New Roman" w:hAnsi="Times New Roman" w:cs="Times New Roman"/>
@@ -2146,11 +1303,10 @@
         </w:rPr>
         <w:t>преп.Зотика</w:t>
       </w:r>
-      <w:proofErr w:type="spellEnd"/>
-    </w:p>
-    <w:p>
-      <w:pPr>
-        <w:pStyle w:val="a5"/>
+    </w:p>
+    <w:p>
+      <w:pPr>
+        <w:pStyle w:val="NormalWeb"/>
         <w:ind w:left="0" w:hanging="2"/>
         <w:rPr>
           <w:rFonts w:cs="Times New Roman"/>
@@ -2168,12 +1324,18 @@
         <w:rPr>
           <w:rFonts w:cs="Times New Roman"/>
         </w:rPr>
-        <w:t xml:space="preserve"> Різдво Твоє, Христе Боже наш,* засвітило світові світло розуміння:* в ньому бо ті, що звіздам служили, від звізди навчилися* поклонятися Тобі – Сонцю правди,* і пізнавати Тебе – Схід з висоти.* Господи, слава Тобі.</w:t>
-      </w:r>
-    </w:p>
-    <w:p>
-      <w:pPr>
-        <w:pStyle w:val="a5"/>
+        <w:t xml:space="preserve"> </w:t>
+      </w:r>
+      <w:r>
+        <w:rPr>
+          <w:rFonts w:cs="Times New Roman"/>
+        </w:rPr>
+        <w:t>Різдво́ Твоє́, Хри́сте Бо́же наш,* засвіти́ло сві́тові сві́тло розумі́ння:* в ньо́му бо ті, що зві́здам служи́ли, від звізди́ навчи́лися* поклоня́тися Тобі́ – Со́нцю пра́вди,* і пізнава́ти Тебе́ – Схід з висоти́.* Го́споди, сла́ва Тобі́.</w:t>
+      </w:r>
+    </w:p>
+    <w:p>
+      <w:pPr>
+        <w:pStyle w:val="NormalWeb"/>
         <w:ind w:left="0" w:hanging="2"/>
         <w:rPr>
           <w:rFonts w:cs="Times New Roman"/>
@@ -2196,42 +1358,14 @@
       </w:r>
       <w:r>
         <w:rPr>
-          <w:rFonts w:cs="Times New Roman"/>
-        </w:rPr>
-        <w:t xml:space="preserve">Діва днесь </w:t>
-      </w:r>
-      <w:proofErr w:type="spellStart"/>
-      <w:r>
-        <w:rPr>
-          <w:rFonts w:cs="Times New Roman"/>
-        </w:rPr>
-        <w:t>преістотного</w:t>
-      </w:r>
-      <w:proofErr w:type="spellEnd"/>
-      <w:r>
-        <w:rPr>
-          <w:rFonts w:cs="Times New Roman"/>
-        </w:rPr>
-        <w:t xml:space="preserve"> родить* і земля вертеп неприступному приносить.* Ангели з пастирями славословлять,* а волхви зо звіздою подорожують,* бо ради нас родилося Дитя мале – </w:t>
-      </w:r>
-      <w:proofErr w:type="spellStart"/>
-      <w:r>
-        <w:rPr>
-          <w:rFonts w:cs="Times New Roman"/>
-        </w:rPr>
-        <w:t>превічний</w:t>
-      </w:r>
-      <w:proofErr w:type="spellEnd"/>
-      <w:r>
-        <w:rPr>
-          <w:rFonts w:cs="Times New Roman"/>
-        </w:rPr>
-        <w:t xml:space="preserve"> Бог.</w:t>
-      </w:r>
-    </w:p>
-    <w:p>
-      <w:pPr>
-        <w:pStyle w:val="1"/>
+          <w:color w:val="000000"/>
+        </w:rPr>
+        <w:t>Ді́ва днесь преісто́тного ро́дить* і земля́ верте́п непристу́пному прино́сить.* А́нгели з па́стирями славосло́влять,* а волхви́ зо звіздо́ю подорожу́ють,* бо ра́ди нас роди́лося дитя́ мале́ – предві́чний Бог.</w:t>
+      </w:r>
+    </w:p>
+    <w:p>
+      <w:pPr>
+        <w:pStyle w:val="Heading1"/>
         <w:ind w:left="0" w:hanging="2"/>
         <w:rPr>
           <w:rFonts w:ascii="Times New Roman" w:hAnsi="Times New Roman" w:cs="Times New Roman"/>
@@ -2255,28 +1389,18 @@
         </w:rPr>
         <w:t xml:space="preserve"> </w:t>
       </w:r>
-      <w:proofErr w:type="spellStart"/>
-      <w:r>
-        <w:rPr>
-          <w:rFonts w:ascii="Times New Roman" w:hAnsi="Times New Roman" w:cs="Times New Roman"/>
-          <w:sz w:val="24"/>
-          <w:szCs w:val="24"/>
-        </w:rPr>
-        <w:t>Преп.Меланії</w:t>
-      </w:r>
-      <w:proofErr w:type="spellEnd"/>
-      <w:r>
-        <w:rPr>
-          <w:rFonts w:ascii="Times New Roman" w:hAnsi="Times New Roman" w:cs="Times New Roman"/>
-          <w:sz w:val="24"/>
-          <w:szCs w:val="24"/>
-        </w:rPr>
-        <w:t xml:space="preserve"> римлянки</w:t>
-      </w:r>
-    </w:p>
-    <w:p>
-      <w:pPr>
-        <w:pStyle w:val="a5"/>
+      <w:r>
+        <w:rPr>
+          <w:rFonts w:ascii="Times New Roman" w:hAnsi="Times New Roman" w:cs="Times New Roman"/>
+          <w:sz w:val="24"/>
+          <w:szCs w:val="24"/>
+        </w:rPr>
+        <w:t>Преп.Меланії римлянки</w:t>
+      </w:r>
+    </w:p>
+    <w:p>
+      <w:pPr>
+        <w:pStyle w:val="NormalWeb"/>
         <w:ind w:left="0" w:hanging="2"/>
         <w:rPr>
           <w:rFonts w:cs="Times New Roman"/>
@@ -2294,12 +1418,18 @@
         <w:rPr>
           <w:rFonts w:cs="Times New Roman"/>
         </w:rPr>
-        <w:t xml:space="preserve"> Різдво Твоє, Христе Боже наш,* засвітило світові світло розуміння:* в ньому бо ті, що звіздам служили, від звізди навчилися* поклонятися Тобі – Сонцю правди,* і пізнавати Тебе – Схід з висоти.* Господи, слава Тобі.</w:t>
-      </w:r>
-    </w:p>
-    <w:p>
-      <w:pPr>
-        <w:pStyle w:val="a5"/>
+        <w:t xml:space="preserve"> </w:t>
+      </w:r>
+      <w:r>
+        <w:rPr>
+          <w:rFonts w:cs="Times New Roman"/>
+        </w:rPr>
+        <w:t>Різдво́ Твоє́, Хри́сте Бо́же наш,* засвіти́ло сві́тові сві́тло розумі́ння:* в ньо́му бо ті, що зві́здам служи́ли, від звізди́ навчи́лися* поклоня́тися Тобі́ – Со́нцю пра́вди,* і пізнава́ти Тебе́ – Схід з висоти́.* Го́споди, сла́ва Тобі́.</w:t>
+      </w:r>
+    </w:p>
+    <w:p>
+      <w:pPr>
+        <w:pStyle w:val="NormalWeb"/>
         <w:ind w:left="0" w:hanging="2"/>
         <w:rPr>
           <w:rFonts w:cs="Times New Roman"/>
@@ -2322,42 +1452,14 @@
       </w:r>
       <w:r>
         <w:rPr>
-          <w:rFonts w:cs="Times New Roman"/>
-        </w:rPr>
-        <w:t xml:space="preserve">Діва днесь </w:t>
-      </w:r>
-      <w:proofErr w:type="spellStart"/>
-      <w:r>
-        <w:rPr>
-          <w:rFonts w:cs="Times New Roman"/>
-        </w:rPr>
-        <w:t>преістотного</w:t>
-      </w:r>
-      <w:proofErr w:type="spellEnd"/>
-      <w:r>
-        <w:rPr>
-          <w:rFonts w:cs="Times New Roman"/>
-        </w:rPr>
-        <w:t xml:space="preserve"> родить* і земля вертеп неприступному приносить.* Ангели з пастирями славословлять,* а волхви зо звіздою подорожують,* бо ради нас родилося Дитя мале – </w:t>
-      </w:r>
-      <w:proofErr w:type="spellStart"/>
-      <w:r>
-        <w:rPr>
-          <w:rFonts w:cs="Times New Roman"/>
-        </w:rPr>
-        <w:t>превічний</w:t>
-      </w:r>
-      <w:proofErr w:type="spellEnd"/>
-      <w:r>
-        <w:rPr>
-          <w:rFonts w:cs="Times New Roman"/>
-        </w:rPr>
-        <w:t xml:space="preserve"> Бог.</w:t>
-      </w:r>
-    </w:p>
-    <w:p>
-      <w:pPr>
-        <w:pStyle w:val="a5"/>
+          <w:color w:val="000000"/>
+        </w:rPr>
+        <w:t>Ді́ва днесь преісто́тного ро́дить* і земля́ верте́п непристу́пному прино́сить.* А́нгели з па́стирями славосло́влять,* а волхви́ зо звіздо́ю подорожу́ють,* бо ра́ди нас роди́лося дитя́ мале́ – предві́чний Бог.</w:t>
+      </w:r>
+    </w:p>
+    <w:p>
+      <w:pPr>
+        <w:pStyle w:val="NormalWeb"/>
         <w:ind w:left="0" w:hanging="2"/>
         <w:rPr>
           <w:rFonts w:cs="Times New Roman"/>
@@ -2771,7 +1873,7 @@
     <w:lsdException w:name="Unresolved Mention" w:semiHidden="1" w:unhideWhenUsed="1"/>
     <w:lsdException w:name="Smart Link" w:semiHidden="1" w:unhideWhenUsed="1"/>
   </w:latentStyles>
-  <w:style w:type="paragraph" w:default="1" w:styleId="a">
+  <w:style w:type="paragraph" w:default="1" w:styleId="Normal">
     <w:name w:val="Normal"/>
     <w:qFormat/>
     <w:pPr>
@@ -2785,10 +1887,10 @@
       <w:position w:val="-1"/>
     </w:rPr>
   </w:style>
-  <w:style w:type="paragraph" w:styleId="1">
+  <w:style w:type="paragraph" w:styleId="Heading1">
     <w:name w:val="heading 1"/>
-    <w:basedOn w:val="a"/>
-    <w:next w:val="a"/>
+    <w:basedOn w:val="Normal"/>
+    <w:next w:val="Normal"/>
     <w:uiPriority w:val="9"/>
     <w:qFormat/>
     <w:pPr>
@@ -2802,10 +1904,10 @@
       <w:szCs w:val="48"/>
     </w:rPr>
   </w:style>
-  <w:style w:type="paragraph" w:styleId="2">
+  <w:style w:type="paragraph" w:styleId="Heading2">
     <w:name w:val="heading 2"/>
-    <w:basedOn w:val="a"/>
-    <w:next w:val="a"/>
+    <w:basedOn w:val="Normal"/>
+    <w:next w:val="Normal"/>
     <w:uiPriority w:val="9"/>
     <w:unhideWhenUsed/>
     <w:qFormat/>
@@ -2821,10 +1923,10 @@
       <w:szCs w:val="36"/>
     </w:rPr>
   </w:style>
-  <w:style w:type="paragraph" w:styleId="3">
+  <w:style w:type="paragraph" w:styleId="Heading3">
     <w:name w:val="heading 3"/>
-    <w:basedOn w:val="a"/>
-    <w:next w:val="a"/>
+    <w:basedOn w:val="Normal"/>
+    <w:next w:val="Normal"/>
     <w:uiPriority w:val="9"/>
     <w:semiHidden/>
     <w:unhideWhenUsed/>
@@ -2841,10 +1943,10 @@
       <w:szCs w:val="28"/>
     </w:rPr>
   </w:style>
-  <w:style w:type="paragraph" w:styleId="4">
+  <w:style w:type="paragraph" w:styleId="Heading4">
     <w:name w:val="heading 4"/>
-    <w:basedOn w:val="a"/>
-    <w:next w:val="a"/>
+    <w:basedOn w:val="Normal"/>
+    <w:next w:val="Normal"/>
     <w:uiPriority w:val="9"/>
     <w:semiHidden/>
     <w:unhideWhenUsed/>
@@ -2861,10 +1963,10 @@
       <w:szCs w:val="24"/>
     </w:rPr>
   </w:style>
-  <w:style w:type="paragraph" w:styleId="5">
+  <w:style w:type="paragraph" w:styleId="Heading5">
     <w:name w:val="heading 5"/>
-    <w:basedOn w:val="a"/>
-    <w:next w:val="a"/>
+    <w:basedOn w:val="Normal"/>
+    <w:next w:val="Normal"/>
     <w:uiPriority w:val="9"/>
     <w:semiHidden/>
     <w:unhideWhenUsed/>
@@ -2879,10 +1981,10 @@
       <w:b/>
     </w:rPr>
   </w:style>
-  <w:style w:type="paragraph" w:styleId="6">
+  <w:style w:type="paragraph" w:styleId="Heading6">
     <w:name w:val="heading 6"/>
-    <w:basedOn w:val="a"/>
-    <w:next w:val="a"/>
+    <w:basedOn w:val="Normal"/>
+    <w:next w:val="Normal"/>
     <w:uiPriority w:val="9"/>
     <w:semiHidden/>
     <w:unhideWhenUsed/>
@@ -2899,13 +2001,13 @@
       <w:szCs w:val="20"/>
     </w:rPr>
   </w:style>
-  <w:style w:type="character" w:default="1" w:styleId="a0">
+  <w:style w:type="character" w:default="1" w:styleId="DefaultParagraphFont">
     <w:name w:val="Default Paragraph Font"/>
     <w:uiPriority w:val="1"/>
     <w:semiHidden/>
     <w:unhideWhenUsed/>
   </w:style>
-  <w:style w:type="table" w:default="1" w:styleId="a1">
+  <w:style w:type="table" w:default="1" w:styleId="TableNormal">
     <w:name w:val="Normal Table"/>
     <w:uiPriority w:val="99"/>
     <w:semiHidden/>
@@ -2920,14 +2022,14 @@
       </w:tblCellMar>
     </w:tblPr>
   </w:style>
-  <w:style w:type="numbering" w:default="1" w:styleId="a2">
+  <w:style w:type="numbering" w:default="1" w:styleId="NoList">
     <w:name w:val="No List"/>
     <w:uiPriority w:val="99"/>
     <w:semiHidden/>
     <w:unhideWhenUsed/>
   </w:style>
-  <w:style w:type="table" w:customStyle="1" w:styleId="TableNormal">
-    <w:name w:val="Table Normal"/>
+  <w:style w:type="table" w:customStyle="1" w:styleId="TableNormal1">
+    <w:name w:val="Table Normal1"/>
     <w:tblPr>
       <w:tblCellMar>
         <w:top w:w="0" w:type="dxa"/>
@@ -2937,10 +2039,10 @@
       </w:tblCellMar>
     </w:tblPr>
   </w:style>
-  <w:style w:type="paragraph" w:styleId="a3">
+  <w:style w:type="paragraph" w:styleId="Title">
     <w:name w:val="Title"/>
-    <w:basedOn w:val="a"/>
-    <w:next w:val="a"/>
+    <w:basedOn w:val="Normal"/>
+    <w:next w:val="Normal"/>
     <w:uiPriority w:val="10"/>
     <w:qFormat/>
     <w:pPr>
@@ -2954,8 +2056,8 @@
       <w:szCs w:val="72"/>
     </w:rPr>
   </w:style>
-  <w:style w:type="table" w:customStyle="1" w:styleId="TableNormal0">
-    <w:name w:val="Table Normal"/>
+  <w:style w:type="table" w:customStyle="1" w:styleId="TableNormal2">
+    <w:name w:val="Table Normal2"/>
     <w:tblPr>
       <w:tblCellMar>
         <w:top w:w="0" w:type="dxa"/>
@@ -2965,9 +2067,9 @@
       </w:tblCellMar>
     </w:tblPr>
   </w:style>
-  <w:style w:type="table" w:customStyle="1" w:styleId="TableNormal1">
-    <w:name w:val="Table Normal"/>
-    <w:next w:val="TableNormal0"/>
+  <w:style w:type="table" w:customStyle="1" w:styleId="TableNormal3">
+    <w:name w:val="Table Normal3"/>
+    <w:next w:val="TableNormal2"/>
     <w:qFormat/>
     <w:pPr>
       <w:suppressAutoHyphens/>
@@ -3036,7 +2138,7 @@
       <w:em w:val="none"/>
     </w:rPr>
   </w:style>
-  <w:style w:type="paragraph" w:styleId="a4">
+  <w:style w:type="paragraph" w:styleId="NoSpacing">
     <w:name w:val="No Spacing"/>
     <w:pPr>
       <w:suppressAutoHyphens/>
@@ -3050,9 +2152,9 @@
       <w:position w:val="-1"/>
     </w:rPr>
   </w:style>
-  <w:style w:type="paragraph" w:styleId="a5">
+  <w:style w:type="paragraph" w:styleId="NormalWeb">
     <w:name w:val="Normal (Web)"/>
-    <w:basedOn w:val="a"/>
+    <w:basedOn w:val="Normal"/>
     <w:uiPriority w:val="99"/>
     <w:qFormat/>
     <w:pPr>
@@ -3064,10 +2166,10 @@
       <w:szCs w:val="24"/>
     </w:rPr>
   </w:style>
-  <w:style w:type="paragraph" w:styleId="a6">
+  <w:style w:type="paragraph" w:styleId="Subtitle">
     <w:name w:val="Subtitle"/>
-    <w:basedOn w:val="a"/>
-    <w:next w:val="a"/>
+    <w:basedOn w:val="Normal"/>
+    <w:next w:val="Normal"/>
     <w:uiPriority w:val="11"/>
     <w:qFormat/>
     <w:pPr>
@@ -3083,9 +2185,9 @@
       <w:szCs w:val="48"/>
     </w:rPr>
   </w:style>
-  <w:style w:type="character" w:styleId="a7">
+  <w:style w:type="character" w:styleId="CommentReference">
     <w:name w:val="annotation reference"/>
-    <w:basedOn w:val="a0"/>
+    <w:basedOn w:val="DefaultParagraphFont"/>
     <w:uiPriority w:val="99"/>
     <w:semiHidden/>
     <w:unhideWhenUsed/>
@@ -3095,10 +2197,10 @@
       <w:szCs w:val="16"/>
     </w:rPr>
   </w:style>
-  <w:style w:type="paragraph" w:styleId="a8">
+  <w:style w:type="paragraph" w:styleId="CommentText">
     <w:name w:val="annotation text"/>
-    <w:basedOn w:val="a"/>
-    <w:link w:val="a9"/>
+    <w:basedOn w:val="Normal"/>
+    <w:link w:val="CommentTextChar"/>
     <w:uiPriority w:val="99"/>
     <w:semiHidden/>
     <w:unhideWhenUsed/>
@@ -3111,10 +2213,10 @@
       <w:szCs w:val="20"/>
     </w:rPr>
   </w:style>
-  <w:style w:type="character" w:customStyle="1" w:styleId="a9">
-    <w:name w:val="Текст примітки Знак"/>
-    <w:basedOn w:val="a0"/>
-    <w:link w:val="a8"/>
+  <w:style w:type="character" w:customStyle="1" w:styleId="CommentTextChar">
+    <w:name w:val="Comment Text Char"/>
+    <w:basedOn w:val="DefaultParagraphFont"/>
+    <w:link w:val="CommentText"/>
     <w:uiPriority w:val="99"/>
     <w:semiHidden/>
     <w:rsid w:val="00EF5290"/>
@@ -3124,11 +2226,11 @@
       <w:szCs w:val="20"/>
     </w:rPr>
   </w:style>
-  <w:style w:type="paragraph" w:styleId="aa">
+  <w:style w:type="paragraph" w:styleId="CommentSubject">
     <w:name w:val="annotation subject"/>
-    <w:basedOn w:val="a8"/>
-    <w:next w:val="a8"/>
-    <w:link w:val="ab"/>
+    <w:basedOn w:val="CommentText"/>
+    <w:next w:val="CommentText"/>
+    <w:link w:val="CommentSubjectChar"/>
     <w:uiPriority w:val="99"/>
     <w:semiHidden/>
     <w:unhideWhenUsed/>
@@ -3138,10 +2240,10 @@
       <w:bCs/>
     </w:rPr>
   </w:style>
-  <w:style w:type="character" w:customStyle="1" w:styleId="ab">
-    <w:name w:val="Тема примітки Знак"/>
-    <w:basedOn w:val="a9"/>
-    <w:link w:val="aa"/>
+  <w:style w:type="character" w:customStyle="1" w:styleId="CommentSubjectChar">
+    <w:name w:val="Comment Subject Char"/>
+    <w:basedOn w:val="CommentTextChar"/>
+    <w:link w:val="CommentSubject"/>
     <w:uiPriority w:val="99"/>
     <w:semiHidden/>
     <w:rsid w:val="00EF5290"/>
@@ -3153,10 +2255,10 @@
       <w:szCs w:val="20"/>
     </w:rPr>
   </w:style>
-  <w:style w:type="paragraph" w:styleId="ac">
+  <w:style w:type="paragraph" w:styleId="BalloonText">
     <w:name w:val="Balloon Text"/>
-    <w:basedOn w:val="a"/>
-    <w:link w:val="ad"/>
+    <w:basedOn w:val="Normal"/>
+    <w:link w:val="BalloonTextChar"/>
     <w:uiPriority w:val="99"/>
     <w:semiHidden/>
     <w:unhideWhenUsed/>
@@ -3170,10 +2272,10 @@
       <w:szCs w:val="16"/>
     </w:rPr>
   </w:style>
-  <w:style w:type="character" w:customStyle="1" w:styleId="ad">
-    <w:name w:val="Текст у виносці Знак"/>
-    <w:basedOn w:val="a0"/>
-    <w:link w:val="ac"/>
+  <w:style w:type="character" w:customStyle="1" w:styleId="BalloonTextChar">
+    <w:name w:val="Balloon Text Char"/>
+    <w:basedOn w:val="DefaultParagraphFont"/>
+    <w:link w:val="BalloonText"/>
     <w:uiPriority w:val="99"/>
     <w:semiHidden/>
     <w:rsid w:val="00EF5290"/>

</xml_diff>